<commit_message>
feat: add metrics computation and report generation scripts
</commit_message>
<xml_diff>
--- a/Movie_Recommendation_System_Report.docx
+++ b/Movie_Recommendation_System_Report.docx
@@ -28,7 +28,7 @@
           <w:i/>
           <w:sz w:val="20"/>
         </w:rPr>
-        <w:t>(An Autonomous &amp; Govt. Aided Institution, Affiliated to VTU, Belagavi)</w:t>
+        <w:t>(An Autonomous and Govt. Aided Institution, Affiliated to VTU, Belagavi)</w:t>
       </w:r>
     </w:p>
     <w:p/>
@@ -256,32 +256,7 @@
           <w:rFonts w:ascii="Times New Roman" w:hAnsi="Times New Roman"/>
           <w:sz w:val="24"/>
         </w:rPr>
-        <w:t>Asst Professor</w:t>
-      </w:r>
-    </w:p>
-    <w:p>
-      <w:pPr>
-        <w:spacing w:after="0"/>
-        <w:jc w:val="center"/>
-      </w:pPr>
-      <w:r>
-        <w:rPr>
-          <w:rFonts w:ascii="Times New Roman" w:hAnsi="Times New Roman"/>
-          <w:sz w:val="24"/>
-        </w:rPr>
-        <w:t>Dept of CS&amp;E</w:t>
-      </w:r>
-    </w:p>
-    <w:p>
-      <w:pPr>
-        <w:jc w:val="center"/>
-      </w:pPr>
-      <w:r>
-        <w:rPr>
-          <w:rFonts w:ascii="Times New Roman" w:hAnsi="Times New Roman"/>
-          <w:sz w:val="24"/>
-        </w:rPr>
-        <w:t>P.E.S.C.E, Mandya</w:t>
+        <w:t>Asst Professor, Dept of CS&amp;E, P.E.S.C.E, Mandya</w:t>
       </w:r>
     </w:p>
     <w:p/>
@@ -333,6 +308,7 @@
       <w:r>
         <w:rPr>
           <w:rFonts w:ascii="Times New Roman" w:hAnsi="Times New Roman"/>
+          <w:color w:val="000000"/>
           <w:sz w:val="28"/>
         </w:rPr>
         <w:t>Abstract</w:t>
@@ -340,7 +316,7 @@
     </w:p>
     <w:p>
       <w:r>
-        <w:t>This project applies the complete Data Analytics Lifecycle to the MovieLens dataset, simulating a recommendation system akin to those used by Netflix and YouTube. The dataset comprises 100,836 ratings from 610 users across 9,742 movies. A range of analytical techniques were implemented in R, including descriptive statistics, principal component analysis (PCA), K-Means clustering, Apriori association rule mining, linear regression, Logistic Regression, K-Nearest Neighbors (KNN), statistical hypothesis testing, and attribute selection. KNN achieved the highest classification accuracy at 60.48%, while Apriori rules revealed strong co-watch patterns among movies (lift up to 3.30). Regression analysis showed limited predictive power from the available features (R-squared = 0.0024). The project demonstrates how the complete data analytics workflow can be applied to a real-world recommendation scenario.</w:t>
+        <w:t>This project applies the complete Data Analytics Lifecycle to the MovieLens dataset, simulating a recommendation system akin to those used by Netflix and YouTube. The dataset comprises 100,836 ratings from 610 users across 9,742 movies. A range of analytical techniques were implemented in R, including descriptive statistics, principal component analysis (PCA) on genre features, K-Means clustering of movies by genre profile, Apriori association rule mining, linear regression using genre indicators, Logistic Regression and K-Nearest Neighbors (KNN) classification based on genre composition, statistical hypothesis testing, and attribute selection. KNN achieved the highest classification accuracy, while Apriori rules revealed strong co-watch patterns among movies with lift values up to 3.30. The project demonstrates how genre-based features can be leveraged within the complete data analytics workflow for a real-world recommendation scenario.</w:t>
       </w:r>
     </w:p>
     <w:p>
@@ -355,6 +331,7 @@
       <w:r>
         <w:rPr>
           <w:rFonts w:ascii="Times New Roman" w:hAnsi="Times New Roman"/>
+          <w:color w:val="000000"/>
           <w:sz w:val="28"/>
         </w:rPr>
         <w:t>Table of Contents</w:t>
@@ -395,7 +372,7 @@
           <w:rFonts w:ascii="Times New Roman" w:hAnsi="Times New Roman"/>
           <w:sz w:val="24"/>
         </w:rPr>
-        <w:t>1. Introduction &amp; Business Context</w:t>
+        <w:t>1. Introduction and Business Context</w:t>
       </w:r>
       <w:r>
         <w:rPr>
@@ -671,7 +648,30 @@
           <w:rFonts w:ascii="Times New Roman" w:hAnsi="Times New Roman"/>
           <w:sz w:val="24"/>
         </w:rPr>
-        <w:t xml:space="preserve">    4.3 Dataset Description</w:t>
+        <w:t xml:space="preserve">    4.3 Genre Extraction</w:t>
+      </w:r>
+      <w:r>
+        <w:rPr>
+          <w:rFonts w:ascii="Times New Roman" w:hAnsi="Times New Roman"/>
+          <w:sz w:val="24"/>
+        </w:rPr>
+        <w:tab/>
+        <w:t>8</w:t>
+      </w:r>
+    </w:p>
+    <w:p>
+      <w:pPr>
+        <w:tabs>
+          <w:tab w:pos="8787" w:val="right" w:leader="dot"/>
+        </w:tabs>
+        <w:spacing w:after="0" w:before="0"/>
+      </w:pPr>
+      <w:r>
+        <w:rPr>
+          <w:rFonts w:ascii="Times New Roman" w:hAnsi="Times New Roman"/>
+          <w:sz w:val="24"/>
+        </w:rPr>
+        <w:t xml:space="preserve">    4.4 Dataset Description</w:t>
       </w:r>
       <w:r>
         <w:rPr>
@@ -740,7 +740,7 @@
           <w:rFonts w:ascii="Times New Roman" w:hAnsi="Times New Roman"/>
           <w:sz w:val="24"/>
         </w:rPr>
-        <w:t xml:space="preserve">    5.2 Data Preprocessing and PCA</w:t>
+        <w:t xml:space="preserve">    5.2 Genre-Based PCA</w:t>
       </w:r>
       <w:r>
         <w:rPr>
@@ -809,7 +809,7 @@
           <w:rFonts w:ascii="Times New Roman" w:hAnsi="Times New Roman"/>
           <w:sz w:val="24"/>
         </w:rPr>
-        <w:t xml:space="preserve">    6.1 K-Means Clustering</w:t>
+        <w:t xml:space="preserve">    6.1 K-Means Clustering (Movie-Level)</w:t>
       </w:r>
       <w:r>
         <w:rPr>
@@ -855,7 +855,7 @@
           <w:rFonts w:ascii="Times New Roman" w:hAnsi="Times New Roman"/>
           <w:sz w:val="24"/>
         </w:rPr>
-        <w:t xml:space="preserve">    6.3 Linear Regression</w:t>
+        <w:t xml:space="preserve">    6.3 Linear Regression (Genre-Based)</w:t>
       </w:r>
       <w:r>
         <w:rPr>
@@ -878,7 +878,7 @@
           <w:rFonts w:ascii="Times New Roman" w:hAnsi="Times New Roman"/>
           <w:sz w:val="24"/>
         </w:rPr>
-        <w:t xml:space="preserve">    6.4 Classification (Logistic Regression and KNN)</w:t>
+        <w:t xml:space="preserve">    6.4 Classification (Genre-Based)</w:t>
       </w:r>
       <w:r>
         <w:rPr>
@@ -924,7 +924,7 @@
           <w:rFonts w:ascii="Times New Roman" w:hAnsi="Times New Roman"/>
           <w:sz w:val="24"/>
         </w:rPr>
-        <w:t xml:space="preserve">    7.1 Descriptive Statistics and Visualizations</w:t>
+        <w:t xml:space="preserve">    7.1 Descriptive Statistics</w:t>
       </w:r>
       <w:r>
         <w:rPr>
@@ -947,7 +947,7 @@
           <w:rFonts w:ascii="Times New Roman" w:hAnsi="Times New Roman"/>
           <w:sz w:val="24"/>
         </w:rPr>
-        <w:t xml:space="preserve">    7.2 PCA and Dimensionality Reduction</w:t>
+        <w:t xml:space="preserve">    7.2 PCA on Genre Features</w:t>
       </w:r>
       <w:r>
         <w:rPr>
@@ -1361,6 +1361,7 @@
       <w:r>
         <w:rPr>
           <w:rFonts w:ascii="Times New Roman" w:hAnsi="Times New Roman"/>
+          <w:color w:val="000000"/>
           <w:sz w:val="28"/>
         </w:rPr>
         <w:t>1. Introduction and Business Context</w:t>
@@ -1373,6 +1374,7 @@
       <w:r>
         <w:rPr>
           <w:rFonts w:ascii="Times New Roman" w:hAnsi="Times New Roman"/>
+          <w:color w:val="000000"/>
           <w:sz w:val="24"/>
         </w:rPr>
         <w:t>1.1 Project Objective</w:t>
@@ -1385,7 +1387,7 @@
     </w:p>
     <w:p>
       <w:r>
-        <w:t>The objective of this project is to build analytical models that understand user preferences and movie patterns from historical rating data, using the MovieLens dataset. The project seeks to:</w:t>
+        <w:t>The objective of this project is to build analytical models that understand user preferences and movie patterns from historical rating data, using genre-based features as the primary predictors. The project seeks to:</w:t>
       </w:r>
     </w:p>
     <w:p>
@@ -1398,7 +1400,7 @@
           <w:rFonts w:ascii="Times New Roman" w:hAnsi="Times New Roman"/>
           <w:sz w:val="24"/>
         </w:rPr>
-        <w:t>Identify patterns in how users rate movies through descriptive statistics and visualizations.</w:t>
+        <w:t>Analyze rating distributions through descriptive statistics and visualizations.</w:t>
       </w:r>
     </w:p>
     <w:p>
@@ -1411,7 +1413,7 @@
           <w:rFonts w:ascii="Times New Roman" w:hAnsi="Times New Roman"/>
           <w:sz w:val="24"/>
         </w:rPr>
-        <w:t>Discover groups of movies frequently watched together using clustering and association rule mining.</w:t>
+        <w:t>Apply PCA to understand the relationship structure among genre categories.</w:t>
       </w:r>
     </w:p>
     <w:p>
@@ -1424,7 +1426,7 @@
           <w:rFonts w:ascii="Times New Roman" w:hAnsi="Times New Roman"/>
           <w:sz w:val="24"/>
         </w:rPr>
-        <w:t>Predict ratings using regression and classify whether a user will like a movie using classification algorithms.</w:t>
+        <w:t>Cluster movies by their genre composition and rating profiles.</w:t>
       </w:r>
     </w:p>
     <w:p>
@@ -1437,7 +1439,7 @@
           <w:rFonts w:ascii="Times New Roman" w:hAnsi="Times New Roman"/>
           <w:sz w:val="24"/>
         </w:rPr>
-        <w:t>Evaluate statistical significance of differences across genres and rating groups.</w:t>
+        <w:t>Discover co-watched movie patterns using association rule mining.</w:t>
       </w:r>
     </w:p>
     <w:p>
@@ -1450,16 +1452,56 @@
           <w:rFonts w:ascii="Times New Roman" w:hAnsi="Times New Roman"/>
           <w:sz w:val="24"/>
         </w:rPr>
-        <w:t>Select the most informative attributes for prediction using filter and wrapper methods.</w:t>
+        <w:t>Predict ratings using genre-based linear regression.</w:t>
       </w:r>
     </w:p>
     <w:p>
       <w:pPr>
-        <w:pStyle w:val="Heading2"/>
+        <w:pStyle w:val="ListBullet"/>
+        <w:spacing w:after="40" w:before="0"/>
       </w:pPr>
       <w:r>
         <w:rPr>
           <w:rFonts w:ascii="Times New Roman" w:hAnsi="Times New Roman"/>
+          <w:sz w:val="24"/>
+        </w:rPr>
+        <w:t>Classify user preferences using genre-based Logistic Regression and KNN.</w:t>
+      </w:r>
+    </w:p>
+    <w:p>
+      <w:pPr>
+        <w:pStyle w:val="ListBullet"/>
+        <w:spacing w:after="40" w:before="0"/>
+      </w:pPr>
+      <w:r>
+        <w:rPr>
+          <w:rFonts w:ascii="Times New Roman" w:hAnsi="Times New Roman"/>
+          <w:sz w:val="24"/>
+        </w:rPr>
+        <w:t>Validate findings through statistical hypothesis testing.</w:t>
+      </w:r>
+    </w:p>
+    <w:p>
+      <w:pPr>
+        <w:pStyle w:val="ListBullet"/>
+        <w:spacing w:after="40" w:before="0"/>
+      </w:pPr>
+      <w:r>
+        <w:rPr>
+          <w:rFonts w:ascii="Times New Roman" w:hAnsi="Times New Roman"/>
+          <w:sz w:val="24"/>
+        </w:rPr>
+        <w:t>Identify the most influential genres through attribute selection.</w:t>
+      </w:r>
+    </w:p>
+    <w:p>
+      <w:pPr>
+        <w:pStyle w:val="Heading2"/>
+      </w:pPr>
+      <w:r>
+        <w:rPr>
+          <w:rFonts w:ascii="Times New Roman" w:hAnsi="Times New Roman"/>
+          <w:color w:val="000000"/>
           <w:sz w:val="24"/>
         </w:rPr>
         <w:t>1.2 Why a Lifecycle Approach</w:t>
@@ -1467,7 +1509,7 @@
     </w:p>
     <w:p>
       <w:r>
-        <w:t>Rather than jumping directly to model training, this project follows the structured Data Analytics Lifecycle to ensure that business understanding, data quality, and evaluation rigor are addressed before any model is operationalized. Each subsequent section of this report corresponds to one phase of that lifecycle. The six-phase framework takes a project from an initial business question through to a deployed, monitored solution.</w:t>
+        <w:t>Rather than jumping directly to model training, this project follows the structured Data Analytics Lifecycle to ensure that business understanding, data quality, and evaluation rigor are addressed before any model is operationalized. Each subsequent section of this report corresponds to one phase of that lifecycle.</w:t>
       </w:r>
     </w:p>
     <w:p>
@@ -1477,6 +1519,7 @@
       <w:r>
         <w:rPr>
           <w:rFonts w:ascii="Times New Roman" w:hAnsi="Times New Roman"/>
+          <w:color w:val="000000"/>
           <w:sz w:val="24"/>
         </w:rPr>
         <w:t>1.3 Scope and Limitations</w:t>
@@ -1484,7 +1527,7 @@
     </w:p>
     <w:p>
       <w:r>
-        <w:t>This project uses the MovieLens Latest Small dataset (100,836 ratings, 610 users, 9,742 movies). The dataset includes no demographic information. Analysis is limited to numeric identifiers (userId, movieId) and rating values. No external data enrichment was performed. All modeling was conducted in R using standard statistical and machine learning packages including arules, factoextra, class, e1071, and corrplot.</w:t>
+        <w:t>This project uses the MovieLens Latest Small dataset (100,836 ratings, 610 users, 9,742 movies). The primary predictive features are 18 binary genre indicators extracted from the genres column. All modeling was conducted in R using standard statistical and machine learning packages.</w:t>
       </w:r>
     </w:p>
     <w:p>
@@ -1494,6 +1537,7 @@
       <w:r>
         <w:rPr>
           <w:rFonts w:ascii="Times New Roman" w:hAnsi="Times New Roman"/>
+          <w:color w:val="000000"/>
           <w:sz w:val="28"/>
         </w:rPr>
         <w:t>2. Methodology: The Data Analytics Lifecycle</w:t>
@@ -1501,7 +1545,7 @@
     </w:p>
     <w:p>
       <w:r>
-        <w:t>The Data Analytics Lifecycle is a six-phase framework that guides a project from an initial business question through to a deployed, monitored solution. The table below summarizes how each phase was applied to the movie recommendation problem.</w:t>
+        <w:t>The Data Analytics Lifecycle is a six-phase framework that guides a project from an initial business question through to a deployed, monitored solution.</w:t>
       </w:r>
     </w:p>
     <w:tbl>
@@ -1528,6 +1572,7 @@
             <w:pPr>
               <w:spacing w:before="40" w:after="40" w:line="240" w:lineRule="auto"/>
               <w:jc w:val="center"/>
+              <w:keepNext/>
             </w:pPr>
             <w:r/>
             <w:r>
@@ -1548,6 +1593,7 @@
             <w:pPr>
               <w:spacing w:before="40" w:after="40" w:line="240" w:lineRule="auto"/>
               <w:jc w:val="center"/>
+              <w:keepNext/>
             </w:pPr>
             <w:r/>
             <w:r>
@@ -1568,6 +1614,7 @@
             <w:pPr>
               <w:spacing w:before="40" w:after="40" w:line="240" w:lineRule="auto"/>
               <w:jc w:val="center"/>
+              <w:keepNext/>
             </w:pPr>
             <w:r/>
             <w:r>
@@ -1700,7 +1747,7 @@
                 <w:rFonts w:ascii="Times New Roman" w:hAnsi="Times New Roman"/>
                 <w:sz w:val="20"/>
               </w:rPr>
-              <w:t>Import CSV files, merge on movieId, handle missing values, check duplicates</w:t>
+              <w:t>Import CSV files, merge datasets, clean data, extract genre indicators</w:t>
             </w:r>
           </w:p>
         </w:tc>
@@ -1762,7 +1809,7 @@
                 <w:rFonts w:ascii="Times New Roman" w:hAnsi="Times New Roman"/>
                 <w:sz w:val="20"/>
               </w:rPr>
-              <w:t>Descriptive statistics, PCA, correlation analysis, train/test split design</w:t>
+              <w:t>Descriptive statistics, genre PCA, correlation analysis, train/test split</w:t>
             </w:r>
           </w:p>
         </w:tc>
@@ -1960,17 +2007,13 @@
       </w:pPr>
     </w:p>
     <w:p>
-      <w:r>
-        <w:t>This iterative structure is deliberately not a strictly linear pipeline. Insights discovered during Model Planning frequently send the analyst back to Data Preparation to engineer additional features.</w:t>
-      </w:r>
-    </w:p>
-    <w:p>
       <w:pPr>
         <w:pStyle w:val="Heading1"/>
       </w:pPr>
       <w:r>
         <w:rPr>
           <w:rFonts w:ascii="Times New Roman" w:hAnsi="Times New Roman"/>
+          <w:color w:val="000000"/>
           <w:sz w:val="28"/>
         </w:rPr>
         <w:t>3. Phase 1 - Discovery</w:t>
@@ -1983,6 +2026,7 @@
       <w:r>
         <w:rPr>
           <w:rFonts w:ascii="Times New Roman" w:hAnsi="Times New Roman"/>
+          <w:color w:val="000000"/>
           <w:sz w:val="24"/>
         </w:rPr>
         <w:t>3.1 Business Problem</w:t>
@@ -1990,7 +2034,7 @@
     </w:p>
     <w:p>
       <w:r>
-        <w:t>Streaming platforms face the challenge of content overload: users are presented with thousands of movies and shows, making it difficult to find content aligned with their preferences. Effective recommendation systems reduce churn, increase user satisfaction, and drive platform engagement. The business problem is to leverage historical rating data to predict user preferences and recommend relevant content.</w:t>
+        <w:t>Streaming platforms face the challenge of content overload: users are presented with thousands of movies and shows, making it difficult to find content aligned with their preferences. Effective recommendation systems reduce churn, increase user satisfaction, and drive platform engagement.</w:t>
       </w:r>
     </w:p>
     <w:p>
@@ -2000,6 +2044,7 @@
       <w:r>
         <w:rPr>
           <w:rFonts w:ascii="Times New Roman" w:hAnsi="Times New Roman"/>
+          <w:color w:val="000000"/>
           <w:sz w:val="24"/>
         </w:rPr>
         <w:t>3.2 Analytics Goal</w:t>
@@ -2007,7 +2052,7 @@
     </w:p>
     <w:p>
       <w:r>
-        <w:t>The Discovery phase translated this business problem into a precise analytics goal: build models that predict whether a user will like a movie and discover patterns in user behavior, using data available from the MovieLens platform.</w:t>
+        <w:t>Build classification and regression models that predict user preferences based on movie genre composition, and discover patterns in co-watched movies using association rules.</w:t>
       </w:r>
     </w:p>
     <w:p>
@@ -2017,14 +2062,10 @@
       <w:r>
         <w:rPr>
           <w:rFonts w:ascii="Times New Roman" w:hAnsi="Times New Roman"/>
+          <w:color w:val="000000"/>
           <w:sz w:val="24"/>
         </w:rPr>
         <w:t>3.3 Success Metrics</w:t>
-      </w:r>
-    </w:p>
-    <w:p>
-      <w:r>
-        <w:t>Before any data was examined, the project defined the metrics by which model performance would be judged:</w:t>
       </w:r>
     </w:p>
     <w:tbl>
@@ -2051,6 +2092,7 @@
             <w:pPr>
               <w:spacing w:before="40" w:after="40" w:line="240" w:lineRule="auto"/>
               <w:jc w:val="center"/>
+              <w:keepNext/>
             </w:pPr>
             <w:r/>
             <w:r>
@@ -2071,6 +2113,7 @@
             <w:pPr>
               <w:spacing w:before="40" w:after="40" w:line="240" w:lineRule="auto"/>
               <w:jc w:val="center"/>
+              <w:keepNext/>
             </w:pPr>
             <w:r/>
             <w:r>
@@ -2091,6 +2134,7 @@
             <w:pPr>
               <w:spacing w:before="40" w:after="40" w:line="240" w:lineRule="auto"/>
               <w:jc w:val="center"/>
+              <w:keepNext/>
             </w:pPr>
             <w:r/>
             <w:r>
@@ -2427,6 +2471,7 @@
       <w:r>
         <w:rPr>
           <w:rFonts w:ascii="Times New Roman" w:hAnsi="Times New Roman"/>
+          <w:color w:val="000000"/>
           <w:sz w:val="28"/>
         </w:rPr>
         <w:t>4. Phase 2 - Data Preparation</w:t>
@@ -2439,6 +2484,7 @@
       <w:r>
         <w:rPr>
           <w:rFonts w:ascii="Times New Roman" w:hAnsi="Times New Roman"/>
+          <w:color w:val="000000"/>
           <w:sz w:val="24"/>
         </w:rPr>
         <w:t>4.1 Data Import and Merging</w:t>
@@ -2446,7 +2492,20 @@
     </w:p>
     <w:p>
       <w:r>
-        <w:t>The MovieLens dataset consists of four CSV files. The ratings and movies tables were loaded into R using read.csv() and merged on the movieId column. The merged dataset contains 100,836 observations with columns: movieId, rating, timestamp, userId, title, and genres.</w:t>
+        <w:t>The MovieLens dataset consists of four CSV files. The ratings and movies tables were loaded into R and merged by movie identifier. The merged dataset contains 100,836 observations with ratings, movie information, and genre details for each user-movie interaction.</w:t>
+      </w:r>
+    </w:p>
+    <w:p>
+      <w:pPr>
+        <w:pStyle w:val="Heading2"/>
+      </w:pPr>
+      <w:r>
+        <w:rPr>
+          <w:rFonts w:ascii="Times New Roman" w:hAnsi="Times New Roman"/>
+          <w:color w:val="000000"/>
+          <w:sz w:val="24"/>
+        </w:rPr>
+        <w:t>4.2 Data Cleaning</w:t>
       </w:r>
     </w:p>
     <w:tbl>
@@ -2473,354 +2532,7 @@
             <w:pPr>
               <w:spacing w:before="40" w:after="40" w:line="240" w:lineRule="auto"/>
               <w:jc w:val="center"/>
-            </w:pPr>
-            <w:r/>
-            <w:r>
-              <w:rPr>
-                <w:rFonts w:ascii="Times New Roman" w:hAnsi="Times New Roman"/>
-                <w:b/>
-                <w:sz w:val="20"/>
-              </w:rPr>
-              <w:t>File</w:t>
-            </w:r>
-          </w:p>
-        </w:tc>
-        <w:tc>
-          <w:tcPr>
-            <w:tcW w:type="dxa" w:w="3120"/>
-          </w:tcPr>
-          <w:p>
-            <w:pPr>
-              <w:spacing w:before="40" w:after="40" w:line="240" w:lineRule="auto"/>
-              <w:jc w:val="center"/>
-            </w:pPr>
-            <w:r/>
-            <w:r>
-              <w:rPr>
-                <w:rFonts w:ascii="Times New Roman" w:hAnsi="Times New Roman"/>
-                <w:b/>
-                <w:sz w:val="20"/>
-              </w:rPr>
-              <w:t>Rows</w:t>
-            </w:r>
-          </w:p>
-        </w:tc>
-        <w:tc>
-          <w:tcPr>
-            <w:tcW w:type="dxa" w:w="3120"/>
-          </w:tcPr>
-          <w:p>
-            <w:pPr>
-              <w:spacing w:before="40" w:after="40" w:line="240" w:lineRule="auto"/>
-              <w:jc w:val="center"/>
-            </w:pPr>
-            <w:r/>
-            <w:r>
-              <w:rPr>
-                <w:rFonts w:ascii="Times New Roman" w:hAnsi="Times New Roman"/>
-                <w:b/>
-                <w:sz w:val="20"/>
-              </w:rPr>
-              <w:t>Key Columns</w:t>
-            </w:r>
-          </w:p>
-        </w:tc>
-      </w:tr>
-      <w:tr>
-        <w:trPr>
-          <w:cantSplit/>
-        </w:trPr>
-        <w:tc>
-          <w:tcPr>
-            <w:tcW w:type="dxa" w:w="3120"/>
-          </w:tcPr>
-          <w:p>
-            <w:pPr>
-              <w:spacing w:before="20" w:after="20" w:line="240" w:lineRule="auto"/>
-              <w:jc w:val="center"/>
-            </w:pPr>
-            <w:r/>
-            <w:r>
-              <w:rPr>
-                <w:rFonts w:ascii="Times New Roman" w:hAnsi="Times New Roman"/>
-                <w:sz w:val="20"/>
-              </w:rPr>
-              <w:t>ratings.csv</w:t>
-            </w:r>
-          </w:p>
-        </w:tc>
-        <w:tc>
-          <w:tcPr>
-            <w:tcW w:type="dxa" w:w="3120"/>
-          </w:tcPr>
-          <w:p>
-            <w:pPr>
-              <w:spacing w:before="20" w:after="20" w:line="240" w:lineRule="auto"/>
-              <w:jc w:val="center"/>
-            </w:pPr>
-            <w:r/>
-            <w:r>
-              <w:rPr>
-                <w:rFonts w:ascii="Times New Roman" w:hAnsi="Times New Roman"/>
-                <w:sz w:val="20"/>
-              </w:rPr>
-              <w:t>100,837</w:t>
-            </w:r>
-          </w:p>
-        </w:tc>
-        <w:tc>
-          <w:tcPr>
-            <w:tcW w:type="dxa" w:w="3120"/>
-          </w:tcPr>
-          <w:p>
-            <w:pPr>
-              <w:spacing w:before="20" w:after="20" w:line="240" w:lineRule="auto"/>
-              <w:jc w:val="center"/>
-            </w:pPr>
-            <w:r/>
-            <w:r>
-              <w:rPr>
-                <w:rFonts w:ascii="Times New Roman" w:hAnsi="Times New Roman"/>
-                <w:sz w:val="20"/>
-              </w:rPr>
-              <w:t>userId, movieId, rating, timestamp</w:t>
-            </w:r>
-          </w:p>
-        </w:tc>
-      </w:tr>
-      <w:tr>
-        <w:trPr>
-          <w:cantSplit/>
-        </w:trPr>
-        <w:tc>
-          <w:tcPr>
-            <w:tcW w:type="dxa" w:w="3120"/>
-          </w:tcPr>
-          <w:p>
-            <w:pPr>
-              <w:spacing w:before="20" w:after="20" w:line="240" w:lineRule="auto"/>
-              <w:jc w:val="center"/>
-            </w:pPr>
-            <w:r/>
-            <w:r>
-              <w:rPr>
-                <w:rFonts w:ascii="Times New Roman" w:hAnsi="Times New Roman"/>
-                <w:sz w:val="20"/>
-              </w:rPr>
-              <w:t>movies.csv</w:t>
-            </w:r>
-          </w:p>
-        </w:tc>
-        <w:tc>
-          <w:tcPr>
-            <w:tcW w:type="dxa" w:w="3120"/>
-          </w:tcPr>
-          <w:p>
-            <w:pPr>
-              <w:spacing w:before="20" w:after="20" w:line="240" w:lineRule="auto"/>
-              <w:jc w:val="center"/>
-            </w:pPr>
-            <w:r/>
-            <w:r>
-              <w:rPr>
-                <w:rFonts w:ascii="Times New Roman" w:hAnsi="Times New Roman"/>
-                <w:sz w:val="20"/>
-              </w:rPr>
-              <w:t>9,743</w:t>
-            </w:r>
-          </w:p>
-        </w:tc>
-        <w:tc>
-          <w:tcPr>
-            <w:tcW w:type="dxa" w:w="3120"/>
-          </w:tcPr>
-          <w:p>
-            <w:pPr>
-              <w:spacing w:before="20" w:after="20" w:line="240" w:lineRule="auto"/>
-              <w:jc w:val="center"/>
-            </w:pPr>
-            <w:r/>
-            <w:r>
-              <w:rPr>
-                <w:rFonts w:ascii="Times New Roman" w:hAnsi="Times New Roman"/>
-                <w:sz w:val="20"/>
-              </w:rPr>
-              <w:t>movieId, title, genres</w:t>
-            </w:r>
-          </w:p>
-        </w:tc>
-      </w:tr>
-      <w:tr>
-        <w:trPr>
-          <w:cantSplit/>
-        </w:trPr>
-        <w:tc>
-          <w:tcPr>
-            <w:tcW w:type="dxa" w:w="3120"/>
-          </w:tcPr>
-          <w:p>
-            <w:pPr>
-              <w:spacing w:before="20" w:after="20" w:line="240" w:lineRule="auto"/>
-              <w:jc w:val="center"/>
-            </w:pPr>
-            <w:r/>
-            <w:r>
-              <w:rPr>
-                <w:rFonts w:ascii="Times New Roman" w:hAnsi="Times New Roman"/>
-                <w:sz w:val="20"/>
-              </w:rPr>
-              <w:t>tags.csv</w:t>
-            </w:r>
-          </w:p>
-        </w:tc>
-        <w:tc>
-          <w:tcPr>
-            <w:tcW w:type="dxa" w:w="3120"/>
-          </w:tcPr>
-          <w:p>
-            <w:pPr>
-              <w:spacing w:before="20" w:after="20" w:line="240" w:lineRule="auto"/>
-              <w:jc w:val="center"/>
-            </w:pPr>
-            <w:r/>
-            <w:r>
-              <w:rPr>
-                <w:rFonts w:ascii="Times New Roman" w:hAnsi="Times New Roman"/>
-                <w:sz w:val="20"/>
-              </w:rPr>
-              <w:t>3,684</w:t>
-            </w:r>
-          </w:p>
-        </w:tc>
-        <w:tc>
-          <w:tcPr>
-            <w:tcW w:type="dxa" w:w="3120"/>
-          </w:tcPr>
-          <w:p>
-            <w:pPr>
-              <w:spacing w:before="20" w:after="20" w:line="240" w:lineRule="auto"/>
-              <w:jc w:val="center"/>
-            </w:pPr>
-            <w:r/>
-            <w:r>
-              <w:rPr>
-                <w:rFonts w:ascii="Times New Roman" w:hAnsi="Times New Roman"/>
-                <w:sz w:val="20"/>
-              </w:rPr>
-              <w:t>userId, movieId, tag, timestamp</w:t>
-            </w:r>
-          </w:p>
-        </w:tc>
-      </w:tr>
-      <w:tr>
-        <w:trPr>
-          <w:cantSplit/>
-        </w:trPr>
-        <w:tc>
-          <w:tcPr>
-            <w:tcW w:type="dxa" w:w="3120"/>
-          </w:tcPr>
-          <w:p>
-            <w:pPr>
-              <w:spacing w:before="20" w:after="20" w:line="240" w:lineRule="auto"/>
-              <w:jc w:val="center"/>
-            </w:pPr>
-            <w:r/>
-            <w:r>
-              <w:rPr>
-                <w:rFonts w:ascii="Times New Roman" w:hAnsi="Times New Roman"/>
-                <w:sz w:val="20"/>
-              </w:rPr>
-              <w:t>links.csv</w:t>
-            </w:r>
-          </w:p>
-        </w:tc>
-        <w:tc>
-          <w:tcPr>
-            <w:tcW w:type="dxa" w:w="3120"/>
-          </w:tcPr>
-          <w:p>
-            <w:pPr>
-              <w:spacing w:before="20" w:after="20" w:line="240" w:lineRule="auto"/>
-              <w:jc w:val="center"/>
-            </w:pPr>
-            <w:r/>
-            <w:r>
-              <w:rPr>
-                <w:rFonts w:ascii="Times New Roman" w:hAnsi="Times New Roman"/>
-                <w:sz w:val="20"/>
-              </w:rPr>
-              <w:t>9,743</w:t>
-            </w:r>
-          </w:p>
-        </w:tc>
-        <w:tc>
-          <w:tcPr>
-            <w:tcW w:type="dxa" w:w="3120"/>
-          </w:tcPr>
-          <w:p>
-            <w:pPr>
-              <w:spacing w:before="20" w:after="20" w:line="240" w:lineRule="auto"/>
-              <w:jc w:val="center"/>
-            </w:pPr>
-            <w:r/>
-            <w:r>
-              <w:rPr>
-                <w:rFonts w:ascii="Times New Roman" w:hAnsi="Times New Roman"/>
-                <w:sz w:val="20"/>
-              </w:rPr>
-              <w:t>movieId, imdbId, tmdbId</w:t>
-            </w:r>
-          </w:p>
-        </w:tc>
-      </w:tr>
-    </w:tbl>
-    <w:p>
-      <w:pPr>
-        <w:spacing w:before="40" w:after="40"/>
-      </w:pPr>
-    </w:p>
-    <w:p>
-      <w:pPr>
-        <w:pStyle w:val="Heading2"/>
-      </w:pPr>
-      <w:r>
-        <w:rPr>
-          <w:rFonts w:ascii="Times New Roman" w:hAnsi="Times New Roman"/>
-          <w:sz w:val="24"/>
-        </w:rPr>
-        <w:t>4.2 Data Cleaning</w:t>
-      </w:r>
-    </w:p>
-    <w:p>
-      <w:r>
-        <w:t>Data quality was verified through three checks:</w:t>
-      </w:r>
-    </w:p>
-    <w:tbl>
-      <w:tblPr>
-        <w:tblStyle w:val="LightGrid-Accent1"/>
-        <w:tblW w:type="auto" w:w="0"/>
-        <w:jc w:val="center"/>
-        <w:tblLook w:firstColumn="1" w:firstRow="1" w:lastColumn="0" w:lastRow="0" w:noHBand="0" w:noVBand="1" w:val="04A0"/>
-      </w:tblPr>
-      <w:tblGrid>
-        <w:gridCol w:w="3120"/>
-        <w:gridCol w:w="3120"/>
-        <w:gridCol w:w="3120"/>
-      </w:tblGrid>
-      <w:tr>
-        <w:trPr>
-          <w:cantSplit/>
-        </w:trPr>
-        <w:tc>
-          <w:tcPr>
-            <w:tcW w:type="dxa" w:w="3120"/>
-          </w:tcPr>
-          <w:p>
-            <w:pPr>
-              <w:spacing w:before="40" w:after="40" w:line="240" w:lineRule="auto"/>
-              <w:jc w:val="center"/>
+              <w:keepNext/>
             </w:pPr>
             <w:r/>
             <w:r>
@@ -2841,6 +2553,7 @@
             <w:pPr>
               <w:spacing w:before="40" w:after="40" w:line="240" w:lineRule="auto"/>
               <w:jc w:val="center"/>
+              <w:keepNext/>
             </w:pPr>
             <w:r/>
             <w:r>
@@ -2861,6 +2574,7 @@
             <w:pPr>
               <w:spacing w:before="40" w:after="40" w:line="240" w:lineRule="auto"/>
               <w:jc w:val="center"/>
+              <w:keepNext/>
             </w:pPr>
             <w:r/>
             <w:r>
@@ -3078,9 +2792,94 @@
       <w:r>
         <w:rPr>
           <w:rFonts w:ascii="Times New Roman" w:hAnsi="Times New Roman"/>
+          <w:color w:val="000000"/>
           <w:sz w:val="24"/>
         </w:rPr>
-        <w:t>4.3 Dataset Description</w:t>
+        <w:t>4.3 Genre Extraction</w:t>
+      </w:r>
+    </w:p>
+    <w:p>
+      <w:r>
+        <w:t>The genres column contains pipe-separated genre labels (e.g., "Action|Comedy|Drama"). A new R script (04_Genre_Extraction.R) parses this column and creates 18 binary indicator variables, one for each genre category. Each indicator is set to 1 if the movie belongs to that genre and 0 otherwise. This converts the categorical genre information into numerical features suitable for PCA, regression, classification, and clustering.</w:t>
+      </w:r>
+    </w:p>
+    <w:tbl>
+      <w:tblPr>
+        <w:tblStyle w:val="LightGrid-Accent1"/>
+        <w:tblW w:type="auto" w:w="0"/>
+        <w:jc w:val="center"/>
+        <w:tblLook w:firstColumn="1" w:firstRow="1" w:lastColumn="0" w:lastRow="0" w:noHBand="0" w:noVBand="1" w:val="04A0"/>
+      </w:tblPr>
+      <w:tblGrid>
+        <w:gridCol w:w="9360"/>
+      </w:tblGrid>
+      <w:tr>
+        <w:trPr>
+          <w:cantSplit/>
+        </w:trPr>
+        <w:tc>
+          <w:tcPr>
+            <w:tcW w:type="dxa" w:w="9360"/>
+          </w:tcPr>
+          <w:p>
+            <w:pPr>
+              <w:spacing w:before="40" w:after="40" w:line="240" w:lineRule="auto"/>
+              <w:jc w:val="center"/>
+              <w:keepNext/>
+            </w:pPr>
+            <w:r/>
+            <w:r>
+              <w:rPr>
+                <w:rFonts w:ascii="Times New Roman" w:hAnsi="Times New Roman"/>
+                <w:b/>
+                <w:sz w:val="20"/>
+              </w:rPr>
+              <w:t>Genre Categories Extracted</w:t>
+            </w:r>
+          </w:p>
+        </w:tc>
+      </w:tr>
+      <w:tr>
+        <w:trPr>
+          <w:cantSplit/>
+        </w:trPr>
+        <w:tc>
+          <w:tcPr>
+            <w:tcW w:type="dxa" w:w="9360"/>
+          </w:tcPr>
+          <w:p>
+            <w:pPr>
+              <w:spacing w:before="20" w:after="20" w:line="240" w:lineRule="auto"/>
+              <w:jc w:val="center"/>
+            </w:pPr>
+            <w:r/>
+            <w:r>
+              <w:rPr>
+                <w:rFonts w:ascii="Times New Roman" w:hAnsi="Times New Roman"/>
+                <w:sz w:val="20"/>
+              </w:rPr>
+              <w:t>Action, Adventure, Animation, Children, Comedy, Crime, Documentary, Drama, Fantasy, Film-Noir, Horror, Musical, Mystery, Romance, Sci-Fi, Thriller, War, Western</w:t>
+            </w:r>
+          </w:p>
+        </w:tc>
+      </w:tr>
+    </w:tbl>
+    <w:p>
+      <w:pPr>
+        <w:spacing w:before="40" w:after="40"/>
+      </w:pPr>
+    </w:p>
+    <w:p>
+      <w:pPr>
+        <w:pStyle w:val="Heading2"/>
+      </w:pPr>
+      <w:r>
+        <w:rPr>
+          <w:rFonts w:ascii="Times New Roman" w:hAnsi="Times New Roman"/>
+          <w:color w:val="000000"/>
+          <w:sz w:val="24"/>
+        </w:rPr>
+        <w:t>4.4 Dataset Summary</w:t>
       </w:r>
     </w:p>
     <w:tbl>
@@ -3106,6 +2905,7 @@
             <w:pPr>
               <w:spacing w:before="40" w:after="40" w:line="240" w:lineRule="auto"/>
               <w:jc w:val="center"/>
+              <w:keepNext/>
             </w:pPr>
             <w:r/>
             <w:r>
@@ -3126,6 +2926,7 @@
             <w:pPr>
               <w:spacing w:before="40" w:after="40" w:line="240" w:lineRule="auto"/>
               <w:jc w:val="center"/>
+              <w:keepNext/>
             </w:pPr>
             <w:r/>
             <w:r>
@@ -3330,7 +3131,7 @@
                 <w:rFonts w:ascii="Times New Roman" w:hAnsi="Times New Roman"/>
                 <w:sz w:val="20"/>
               </w:rPr>
-              <w:t>Time Period</w:t>
+              <w:t>Genre Features</w:t>
             </w:r>
           </w:p>
         </w:tc>
@@ -3349,7 +3150,7 @@
                 <w:rFonts w:ascii="Times New Roman" w:hAnsi="Times New Roman"/>
                 <w:sz w:val="20"/>
               </w:rPr>
-              <w:t>March 1996 to September 2018</w:t>
+              <w:t>18 binary indicators</w:t>
             </w:r>
           </w:p>
         </w:tc>
@@ -3404,17 +3205,13 @@
       </w:pPr>
     </w:p>
     <w:p>
-      <w:r>
-        <w:t>The 18 genre categories are: Action, Adventure, Animation, Children, Comedy, Crime, Documentary, Drama, Fantasy, Film-Noir, Horror, Musical, Mystery, Romance, Sci-Fi, Thriller, War, and Western.</w:t>
-      </w:r>
-    </w:p>
-    <w:p>
       <w:pPr>
         <w:pStyle w:val="Heading1"/>
       </w:pPr>
       <w:r>
         <w:rPr>
           <w:rFonts w:ascii="Times New Roman" w:hAnsi="Times New Roman"/>
+          <w:color w:val="000000"/>
           <w:sz w:val="28"/>
         </w:rPr>
         <w:t>5. Phase 3 - Model Planning (Exploratory Data Analysis)</w:t>
@@ -3427,6 +3224,7 @@
       <w:r>
         <w:rPr>
           <w:rFonts w:ascii="Times New Roman" w:hAnsi="Times New Roman"/>
+          <w:color w:val="000000"/>
           <w:sz w:val="24"/>
         </w:rPr>
         <w:t>5.1 Descriptive Statistics</w:t>
@@ -3434,7 +3232,7 @@
     </w:p>
     <w:p>
       <w:r>
-        <w:t>Summary statistics were computed for the rating variable to understand its distribution before modeling.</w:t>
+        <w:t>Summary statistics were computed for the rating variable.</w:t>
       </w:r>
     </w:p>
     <w:tbl>
@@ -3460,6 +3258,7 @@
             <w:pPr>
               <w:spacing w:before="40" w:after="40" w:line="240" w:lineRule="auto"/>
               <w:jc w:val="center"/>
+              <w:keepNext/>
             </w:pPr>
             <w:r/>
             <w:r>
@@ -3480,6 +3279,7 @@
             <w:pPr>
               <w:spacing w:before="40" w:after="40" w:line="240" w:lineRule="auto"/>
               <w:jc w:val="center"/>
+              <w:keepNext/>
             </w:pPr>
             <w:r/>
             <w:r>
@@ -3617,7 +3417,7 @@
                 <w:rFonts w:ascii="Times New Roman" w:hAnsi="Times New Roman"/>
                 <w:sz w:val="20"/>
               </w:rPr>
-              <w:t>[Value]</w:t>
+              <w:t>1.0425</w:t>
             </w:r>
           </w:p>
         </w:tc>
@@ -3660,7 +3460,7 @@
                 <w:rFonts w:ascii="Times New Roman" w:hAnsi="Times New Roman"/>
                 <w:sz w:val="20"/>
               </w:rPr>
-              <w:t>[Value]</w:t>
+              <w:t>1.0869</w:t>
             </w:r>
           </w:p>
         </w:tc>
@@ -3727,7 +3527,7 @@
           <w:i/>
           <w:sz w:val="20"/>
         </w:rPr>
-        <w:t>Figure 1.1 - Histogram showing distribution of movie ratings across the 0.5 to 5.0 scale.</w:t>
+        <w:t>Figure 1.1 - Histogram showing distribution of movie ratings.</w:t>
       </w:r>
     </w:p>
     <w:p>
@@ -3738,7 +3538,7 @@
       <w:r>
         <w:drawing>
           <wp:inline xmlns:a="http://schemas.openxmlformats.org/drawingml/2006/main" xmlns:pic="http://schemas.openxmlformats.org/drawingml/2006/picture">
-            <wp:extent cx="4572000" cy="3429000"/>
+            <wp:extent cx="4572000" cy="4572000"/>
             <wp:docPr id="2" name="Picture 2"/>
             <wp:cNvGraphicFramePr>
               <a:graphicFrameLocks noChangeAspect="1"/>
@@ -3759,7 +3559,7 @@
                   <pic:spPr>
                     <a:xfrm>
                       <a:off x="0" y="0"/>
-                      <a:ext cx="4572000" cy="3429000"/>
+                      <a:ext cx="4572000" cy="4572000"/>
                     </a:xfrm>
                     <a:prstGeom prst="rect"/>
                   </pic:spPr>
@@ -3781,7 +3581,7 @@
           <w:i/>
           <w:sz w:val="20"/>
         </w:rPr>
-        <w:t>Figure 1.2 - Boxplot showing interquartile range from 3.0 to 4.0 with median at 3.5.</w:t>
+        <w:t>Figure 1.2 - Boxplot of ratings showing median and interquartile range.</w:t>
       </w:r>
     </w:p>
     <w:p>
@@ -3835,7 +3635,7 @@
           <w:i/>
           <w:sz w:val="20"/>
         </w:rPr>
-        <w:t>Figure 1.3 - Bar plot showing frequency of each rating value. Rating 4.0 is the most common.</w:t>
+        <w:t>Figure 1.3 - Bar plot of rating frequencies.</w:t>
       </w:r>
     </w:p>
     <w:p>
@@ -3845,14 +3645,15 @@
       <w:r>
         <w:rPr>
           <w:rFonts w:ascii="Times New Roman" w:hAnsi="Times New Roman"/>
+          <w:color w:val="000000"/>
           <w:sz w:val="24"/>
         </w:rPr>
-        <w:t>5.2 Data Preprocessing and PCA</w:t>
+        <w:t>5.2 Genre-Based PCA</w:t>
       </w:r>
     </w:p>
     <w:p>
       <w:r>
-        <w:t>Numerical variables (userId, movieId, rating) were standardized using z-score normalization. PCA was then performed on the scaled data to transform correlated variables into uncorrelated principal components.</w:t>
+        <w:t>Principal Component Analysis (PCA) was applied to the 18 binary genre indicators to understand the underlying structure of genre relationships. PCA identifies which genres tend to co-occur and reduces dimensionality while preserving variance.</w:t>
       </w:r>
     </w:p>
     <w:tbl>
@@ -3879,6 +3680,7 @@
             <w:pPr>
               <w:spacing w:before="40" w:after="40" w:line="240" w:lineRule="auto"/>
               <w:jc w:val="center"/>
+              <w:keepNext/>
             </w:pPr>
             <w:r/>
             <w:r>
@@ -3899,6 +3701,7 @@
             <w:pPr>
               <w:spacing w:before="40" w:after="40" w:line="240" w:lineRule="auto"/>
               <w:jc w:val="center"/>
+              <w:keepNext/>
             </w:pPr>
             <w:r/>
             <w:r>
@@ -3907,7 +3710,7 @@
                 <w:b/>
                 <w:sz w:val="20"/>
               </w:rPr>
-              <w:t>Variance Proportion</w:t>
+              <w:t>Variance Explained</w:t>
             </w:r>
           </w:p>
         </w:tc>
@@ -3919,6 +3722,7 @@
             <w:pPr>
               <w:spacing w:before="40" w:after="40" w:line="240" w:lineRule="auto"/>
               <w:jc w:val="center"/>
+              <w:keepNext/>
             </w:pPr>
             <w:r/>
             <w:r>
@@ -3970,7 +3774,7 @@
                 <w:rFonts w:ascii="Times New Roman" w:hAnsi="Times New Roman"/>
                 <w:sz w:val="20"/>
               </w:rPr>
-              <w:t>[Value]</w:t>
+              <w:t>0.2061</w:t>
             </w:r>
           </w:p>
         </w:tc>
@@ -3989,7 +3793,7 @@
                 <w:rFonts w:ascii="Times New Roman" w:hAnsi="Times New Roman"/>
                 <w:sz w:val="20"/>
               </w:rPr>
-              <w:t>[Value]</w:t>
+              <w:t>0.2061</w:t>
             </w:r>
           </w:p>
         </w:tc>
@@ -4032,7 +3836,7 @@
                 <w:rFonts w:ascii="Times New Roman" w:hAnsi="Times New Roman"/>
                 <w:sz w:val="20"/>
               </w:rPr>
-              <w:t>[Value]</w:t>
+              <w:t>0.1878</w:t>
             </w:r>
           </w:p>
         </w:tc>
@@ -4051,7 +3855,7 @@
                 <w:rFonts w:ascii="Times New Roman" w:hAnsi="Times New Roman"/>
                 <w:sz w:val="20"/>
               </w:rPr>
-              <w:t>[Value]</w:t>
+              <w:t>0.3939</w:t>
             </w:r>
           </w:p>
         </w:tc>
@@ -4094,7 +3898,7 @@
                 <w:rFonts w:ascii="Times New Roman" w:hAnsi="Times New Roman"/>
                 <w:sz w:val="20"/>
               </w:rPr>
-              <w:t>[Value]</w:t>
+              <w:t>0.1181</w:t>
             </w:r>
           </w:p>
         </w:tc>
@@ -4113,7 +3917,7 @@
                 <w:rFonts w:ascii="Times New Roman" w:hAnsi="Times New Roman"/>
                 <w:sz w:val="20"/>
               </w:rPr>
-              <w:t>[Value]</w:t>
+              <w:t>0.512</w:t>
             </w:r>
           </w:p>
         </w:tc>
@@ -4175,7 +3979,7 @@
           <w:i/>
           <w:sz w:val="20"/>
         </w:rPr>
-        <w:t>Figure 2.1 - Scree plot showing variance explained by each principal component.</w:t>
+        <w:t>Figure 2.1 - Scree plot showing variance explained by each principal component from genre PCA.</w:t>
       </w:r>
     </w:p>
     <w:p>
@@ -4186,7 +3990,7 @@
       <w:r>
         <w:drawing>
           <wp:inline xmlns:a="http://schemas.openxmlformats.org/drawingml/2006/main" xmlns:pic="http://schemas.openxmlformats.org/drawingml/2006/picture">
-            <wp:extent cx="4572000" cy="3429000"/>
+            <wp:extent cx="4572000" cy="3657600"/>
             <wp:docPr id="5" name="Picture 5"/>
             <wp:cNvGraphicFramePr>
               <a:graphicFrameLocks noChangeAspect="1"/>
@@ -4207,7 +4011,7 @@
                   <pic:spPr>
                     <a:xfrm>
                       <a:off x="0" y="0"/>
-                      <a:ext cx="4572000" cy="3429000"/>
+                      <a:ext cx="4572000" cy="3657600"/>
                     </a:xfrm>
                     <a:prstGeom prst="rect"/>
                   </pic:spPr>
@@ -4229,42 +4033,35 @@
           <w:i/>
           <w:sz w:val="20"/>
         </w:rPr>
-        <w:t>Figure 2.2 - PCA biplot showing observations and variable loadings on the first two principal components.</w:t>
+        <w:t>Figure 2.2 - PCA biplot showing genre relationships in component space.</w:t>
+      </w:r>
+    </w:p>
+    <w:p>
+      <w:pPr>
+        <w:pStyle w:val="Heading2"/>
+      </w:pPr>
+      <w:r>
+        <w:rPr>
+          <w:rFonts w:ascii="Times New Roman" w:hAnsi="Times New Roman"/>
+          <w:color w:val="000000"/>
+          <w:sz w:val="24"/>
+        </w:rPr>
+        <w:t>5.3 Train/Test Split Design</w:t>
       </w:r>
     </w:p>
     <w:p>
       <w:r>
-        <w:rPr>
-          <w:i/>
-          <w:sz w:val="20"/>
-        </w:rPr>
-        <w:t>Note: Fill variance values after running summary(pca_model) in R.</w:t>
+        <w:t>For classification, data was split into training (80%) and testing (20%) sets using a random seed (set.seed(123)). A binary target variable (liked) was created where liked = 1 if rating &gt;= 4 and 0 otherwise.</w:t>
       </w:r>
     </w:p>
     <w:p>
       <w:pPr>
-        <w:pStyle w:val="Heading2"/>
+        <w:pStyle w:val="Heading1"/>
       </w:pPr>
       <w:r>
         <w:rPr>
           <w:rFonts w:ascii="Times New Roman" w:hAnsi="Times New Roman"/>
-          <w:sz w:val="24"/>
-        </w:rPr>
-        <w:t>5.3 Train / Test Split Design</w:t>
-      </w:r>
-    </w:p>
-    <w:p>
-      <w:r>
-        <w:t>For classification, data was split into training (80%) and testing (20%) sets using a random seed (set.seed(123)) for reproducibility. A binary target variable (liked) was created where liked = 1 if rating &gt;= 4 and 0 otherwise.</w:t>
-      </w:r>
-    </w:p>
-    <w:p>
-      <w:pPr>
-        <w:pStyle w:val="Heading1"/>
-      </w:pPr>
-      <w:r>
-        <w:rPr>
-          <w:rFonts w:ascii="Times New Roman" w:hAnsi="Times New Roman"/>
+          <w:color w:val="000000"/>
           <w:sz w:val="28"/>
         </w:rPr>
         <w:t>6. Phase 4 - Model Building</w:t>
@@ -4277,14 +4074,15 @@
       <w:r>
         <w:rPr>
           <w:rFonts w:ascii="Times New Roman" w:hAnsi="Times New Roman"/>
+          <w:color w:val="000000"/>
           <w:sz w:val="24"/>
         </w:rPr>
-        <w:t>6.1 K-Means Clustering</w:t>
+        <w:t>6.1 K-Means Clustering (Movie-Level)</w:t>
       </w:r>
     </w:p>
     <w:p>
       <w:r>
-        <w:t>K-Means clustering was applied with k = 3 on the scaled data. The algorithm minimizes within-cluster sum of squares to partition observations into k clusters.</w:t>
+        <w:t>For clustering, the data was aggregated at the movie level. Each movie is represented by its average rating, number of ratings received, and its 18 genre indicators. K-Means clustering (k = 3) was applied to group movies by their rating profile and genre composition.</w:t>
       </w:r>
     </w:p>
     <w:p>
@@ -4295,7 +4093,7 @@
       <w:r>
         <w:drawing>
           <wp:inline xmlns:a="http://schemas.openxmlformats.org/drawingml/2006/main" xmlns:pic="http://schemas.openxmlformats.org/drawingml/2006/picture">
-            <wp:extent cx="4572000" cy="3429000"/>
+            <wp:extent cx="4572000" cy="3657600"/>
             <wp:docPr id="6" name="Picture 6"/>
             <wp:cNvGraphicFramePr>
               <a:graphicFrameLocks noChangeAspect="1"/>
@@ -4316,7 +4114,7 @@
                   <pic:spPr>
                     <a:xfrm>
                       <a:off x="0" y="0"/>
-                      <a:ext cx="4572000" cy="3429000"/>
+                      <a:ext cx="4572000" cy="3657600"/>
                     </a:xfrm>
                     <a:prstGeom prst="rect"/>
                   </pic:spPr>
@@ -4338,7 +4136,7 @@
           <w:i/>
           <w:sz w:val="20"/>
         </w:rPr>
-        <w:t>Figure 3.1 - K-Means cluster visualization with data points projected onto PC1 and PC2, colored by cluster (k=3).</w:t>
+        <w:t>Figure 3.1 - K-Means cluster visualization of movies by genre and rating profile.</w:t>
       </w:r>
     </w:p>
     <w:p>
@@ -4349,7 +4147,7 @@
       <w:r>
         <w:drawing>
           <wp:inline xmlns:a="http://schemas.openxmlformats.org/drawingml/2006/main" xmlns:pic="http://schemas.openxmlformats.org/drawingml/2006/picture">
-            <wp:extent cx="4572000" cy="3429000"/>
+            <wp:extent cx="4572000" cy="1959429"/>
             <wp:docPr id="7" name="Picture 7"/>
             <wp:cNvGraphicFramePr>
               <a:graphicFrameLocks noChangeAspect="1"/>
@@ -4370,7 +4168,7 @@
                   <pic:spPr>
                     <a:xfrm>
                       <a:off x="0" y="0"/>
-                      <a:ext cx="4572000" cy="3429000"/>
+                      <a:ext cx="4572000" cy="1959429"/>
                     </a:xfrm>
                     <a:prstGeom prst="rect"/>
                   </pic:spPr>
@@ -4392,12 +4190,12 @@
           <w:i/>
           <w:sz w:val="20"/>
         </w:rPr>
-        <w:t>Figure 3.2 - Cluster centers plot showing centroids of the 3 K-Means clusters.</w:t>
+        <w:t>Figure 3.2 - Cluster centers showing the genre profile of each movie cluster.</w:t>
       </w:r>
     </w:p>
     <w:p>
       <w:r>
-        <w:t>K-Means with k = 3 produced distinct groups interpretable in the context of user-movie interaction patterns.</w:t>
+        <w:t>K-Means with k = 3 produced distinct movie groups based on genre composition and popularity.</w:t>
       </w:r>
     </w:p>
     <w:p>
@@ -4407,6 +4205,7 @@
       <w:r>
         <w:rPr>
           <w:rFonts w:ascii="Times New Roman" w:hAnsi="Times New Roman"/>
+          <w:color w:val="000000"/>
           <w:sz w:val="24"/>
         </w:rPr>
         <w:t>6.2 Frequent Pattern Mining (Apriori Algorithm)</w:t>
@@ -4443,6 +4242,7 @@
             <w:pPr>
               <w:spacing w:before="40" w:after="40" w:line="240" w:lineRule="auto"/>
               <w:jc w:val="center"/>
+              <w:keepNext/>
             </w:pPr>
             <w:r/>
             <w:r>
@@ -4463,6 +4263,7 @@
             <w:pPr>
               <w:spacing w:before="40" w:after="40" w:line="240" w:lineRule="auto"/>
               <w:jc w:val="center"/>
+              <w:keepNext/>
             </w:pPr>
             <w:r/>
             <w:r>
@@ -4483,6 +4284,7 @@
             <w:pPr>
               <w:spacing w:before="40" w:after="40" w:line="240" w:lineRule="auto"/>
               <w:jc w:val="center"/>
+              <w:keepNext/>
             </w:pPr>
             <w:r/>
             <w:r>
@@ -4503,6 +4305,7 @@
             <w:pPr>
               <w:spacing w:before="40" w:after="40" w:line="240" w:lineRule="auto"/>
               <w:jc w:val="center"/>
+              <w:keepNext/>
             </w:pPr>
             <w:r/>
             <w:r>
@@ -4523,6 +4326,7 @@
             <w:pPr>
               <w:spacing w:before="40" w:after="40" w:line="240" w:lineRule="auto"/>
               <w:jc w:val="center"/>
+              <w:keepNext/>
             </w:pPr>
             <w:r/>
             <w:r>
@@ -5544,7 +5348,7 @@
     </w:p>
     <w:p>
       <w:r>
-        <w:t>All top rules achieved perfect confidence (1.000) with lift values from 1.85 to 3.30, indicating strong associations beyond random chance.</w:t>
+        <w:t>All top rules achieved perfect confidence (1.000) with lift values from 1.85 to 3.30.</w:t>
       </w:r>
     </w:p>
     <w:p>
@@ -5554,14 +5358,15 @@
       <w:r>
         <w:rPr>
           <w:rFonts w:ascii="Times New Roman" w:hAnsi="Times New Roman"/>
+          <w:color w:val="000000"/>
           <w:sz w:val="24"/>
         </w:rPr>
-        <w:t>6.3 Linear Regression</w:t>
+        <w:t>6.3 Linear Regression (Genre-Based)</w:t>
       </w:r>
     </w:p>
     <w:p>
       <w:r>
-        <w:t>A linear regression model was built to predict movie ratings using userId and movieId as predictor variables.</w:t>
+        <w:t>A linear regression model was built to predict movie ratings using all 18 genre indicators as predictors. The formula is: rating ~ Action + Adventure + Animation + ... + Western.</w:t>
       </w:r>
     </w:p>
     <w:tbl>
@@ -5587,6 +5392,7 @@
             <w:pPr>
               <w:spacing w:before="40" w:after="40" w:line="240" w:lineRule="auto"/>
               <w:jc w:val="center"/>
+              <w:keepNext/>
             </w:pPr>
             <w:r/>
             <w:r>
@@ -5607,6 +5413,7 @@
             <w:pPr>
               <w:spacing w:before="40" w:after="40" w:line="240" w:lineRule="auto"/>
               <w:jc w:val="center"/>
+              <w:keepNext/>
             </w:pPr>
             <w:r/>
             <w:r>
@@ -5639,7 +5446,7 @@
                 <w:rFonts w:ascii="Times New Roman" w:hAnsi="Times New Roman"/>
                 <w:sz w:val="20"/>
               </w:rPr>
-              <w:t>Mean Absolute Error (MAE)</w:t>
+              <w:t>MAE</w:t>
             </w:r>
           </w:p>
         </w:tc>
@@ -5658,7 +5465,7 @@
                 <w:rFonts w:ascii="Times New Roman" w:hAnsi="Times New Roman"/>
                 <w:sz w:val="20"/>
               </w:rPr>
-              <w:t>0.8304</w:t>
+              <w:t>0.8141</w:t>
             </w:r>
           </w:p>
         </w:tc>
@@ -5682,7 +5489,7 @@
                 <w:rFonts w:ascii="Times New Roman" w:hAnsi="Times New Roman"/>
                 <w:sz w:val="20"/>
               </w:rPr>
-              <w:t>Mean Squared Error (MSE)</w:t>
+              <w:t>MSE</w:t>
             </w:r>
           </w:p>
         </w:tc>
@@ -5701,7 +5508,7 @@
                 <w:rFonts w:ascii="Times New Roman" w:hAnsi="Times New Roman"/>
                 <w:sz w:val="20"/>
               </w:rPr>
-              <w:t>1.0842</w:t>
+              <w:t>1.045</w:t>
             </w:r>
           </w:p>
         </w:tc>
@@ -5725,7 +5532,7 @@
                 <w:rFonts w:ascii="Times New Roman" w:hAnsi="Times New Roman"/>
                 <w:sz w:val="20"/>
               </w:rPr>
-              <w:t>Root Mean Squared Error (RMSE)</w:t>
+              <w:t>RMSE</w:t>
             </w:r>
           </w:p>
         </w:tc>
@@ -5744,7 +5551,7 @@
                 <w:rFonts w:ascii="Times New Roman" w:hAnsi="Times New Roman"/>
                 <w:sz w:val="20"/>
               </w:rPr>
-              <w:t>1.0412</w:t>
+              <w:t>1.0223</w:t>
             </w:r>
           </w:p>
         </w:tc>
@@ -5787,7 +5594,7 @@
                 <w:rFonts w:ascii="Times New Roman" w:hAnsi="Times New Roman"/>
                 <w:sz w:val="20"/>
               </w:rPr>
-              <w:t>0.0024</w:t>
+              <w:t>0.0385</w:t>
             </w:r>
           </w:p>
         </w:tc>
@@ -5800,7 +5607,7 @@
     </w:p>
     <w:p>
       <w:r>
-        <w:t>The R-squared value of 0.0024 indicates the predictors explain only 0.24% of rating variance. Additional features such as genre and temporal patterns would be necessary for accurate prediction.</w:t>
+        <w:t>Using genre features as predictors provides interpretable coefficients showing how each genre influences the expected rating.</w:t>
       </w:r>
     </w:p>
     <w:p>
@@ -5811,7 +5618,7 @@
       <w:r>
         <w:drawing>
           <wp:inline xmlns:a="http://schemas.openxmlformats.org/drawingml/2006/main" xmlns:pic="http://schemas.openxmlformats.org/drawingml/2006/picture">
-            <wp:extent cx="4572000" cy="3429000"/>
+            <wp:extent cx="4572000" cy="4572000"/>
             <wp:docPr id="8" name="Picture 8"/>
             <wp:cNvGraphicFramePr>
               <a:graphicFrameLocks noChangeAspect="1"/>
@@ -5832,7 +5639,7 @@
                   <pic:spPr>
                     <a:xfrm>
                       <a:off x="0" y="0"/>
-                      <a:ext cx="4572000" cy="3429000"/>
+                      <a:ext cx="4572000" cy="4572000"/>
                     </a:xfrm>
                     <a:prstGeom prst="rect"/>
                   </pic:spPr>
@@ -5854,7 +5661,7 @@
           <w:i/>
           <w:sz w:val="20"/>
         </w:rPr>
-        <w:t>Figure 4.1 - Scatter plot of User ID vs Rating with regression line.</w:t>
+        <w:t>Figure 4.1 - Scatter plot of actual vs predicted ratings from genre regression.</w:t>
       </w:r>
     </w:p>
     <w:p>
@@ -5908,7 +5715,7 @@
           <w:i/>
           <w:sz w:val="20"/>
         </w:rPr>
-        <w:t>Figure 4.2 - Residual plot showing the difference between predicted and actual ratings.</w:t>
+        <w:t>Figure 4.2 - Residual plot from genre-based regression model.</w:t>
       </w:r>
     </w:p>
     <w:p>
@@ -5918,9 +5725,10 @@
       <w:r>
         <w:rPr>
           <w:rFonts w:ascii="Times New Roman" w:hAnsi="Times New Roman"/>
+          <w:color w:val="000000"/>
           <w:sz w:val="24"/>
         </w:rPr>
-        <w:t>6.4 Classification</w:t>
+        <w:t>6.4 Classification (Genre-Based)</w:t>
       </w:r>
     </w:p>
     <w:p>
@@ -5931,9 +5739,15 @@
         <w:rPr>
           <w:rFonts w:ascii="Times New Roman" w:hAnsi="Times New Roman"/>
           <w:i/>
+          <w:color w:val="000000"/>
           <w:sz w:val="24"/>
         </w:rPr>
         <w:t>Logistic Regression</w:t>
+      </w:r>
+    </w:p>
+    <w:p>
+      <w:r>
+        <w:t>Logistic Regression using genre indicators as features to predict liked/disliked.</w:t>
       </w:r>
     </w:p>
     <w:tbl>
@@ -5959,6 +5773,7 @@
             <w:pPr>
               <w:spacing w:before="40" w:after="40" w:line="240" w:lineRule="auto"/>
               <w:jc w:val="center"/>
+              <w:keepNext/>
             </w:pPr>
             <w:r/>
             <w:r>
@@ -5979,6 +5794,7 @@
             <w:pPr>
               <w:spacing w:before="40" w:after="40" w:line="240" w:lineRule="auto"/>
               <w:jc w:val="center"/>
+              <w:keepNext/>
             </w:pPr>
             <w:r/>
             <w:r>
@@ -6030,7 +5846,7 @@
                 <w:rFonts w:ascii="Times New Roman" w:hAnsi="Times New Roman"/>
                 <w:sz w:val="20"/>
               </w:rPr>
-              <w:t>52.32%</w:t>
+              <w:t>0.5713</w:t>
             </w:r>
           </w:p>
         </w:tc>
@@ -6073,7 +5889,7 @@
                 <w:rFonts w:ascii="Times New Roman" w:hAnsi="Times New Roman"/>
                 <w:sz w:val="20"/>
               </w:rPr>
-              <w:t>50.75%</w:t>
+              <w:t>0.5679</w:t>
             </w:r>
           </w:p>
         </w:tc>
@@ -6116,7 +5932,7 @@
                 <w:rFonts w:ascii="Times New Roman" w:hAnsi="Times New Roman"/>
                 <w:sz w:val="20"/>
               </w:rPr>
-              <w:t>30.51%</w:t>
+              <w:t>0.4611</w:t>
             </w:r>
           </w:p>
         </w:tc>
@@ -6159,7 +5975,7 @@
                 <w:rFonts w:ascii="Times New Roman" w:hAnsi="Times New Roman"/>
                 <w:sz w:val="20"/>
               </w:rPr>
-              <w:t>38.11%</w:t>
+              <w:t>0.5089</w:t>
             </w:r>
           </w:p>
         </w:tc>
@@ -6171,11 +5987,6 @@
       </w:pPr>
     </w:p>
     <w:p>
-      <w:r>
-        <w:t>Logistic Regression achieved an accuracy of 52.32%. The model exhibited low recall and F1-score.</w:t>
-      </w:r>
-    </w:p>
-    <w:p>
       <w:pPr>
         <w:pStyle w:val="Heading3"/>
       </w:pPr>
@@ -6183,6 +5994,7 @@
         <w:rPr>
           <w:rFonts w:ascii="Times New Roman" w:hAnsi="Times New Roman"/>
           <w:i/>
+          <w:color w:val="000000"/>
           <w:sz w:val="24"/>
         </w:rPr>
         <w:t>K-Nearest Neighbors (KNN)</w:t>
@@ -6190,7 +6002,7 @@
     </w:p>
     <w:p>
       <w:r>
-        <w:t>KNN was performed with k = 5 using normalized predictor variables.</w:t>
+        <w:t>KNN with k = 5 using genre indicators as feature space.</w:t>
       </w:r>
     </w:p>
     <w:tbl>
@@ -6216,6 +6028,7 @@
             <w:pPr>
               <w:spacing w:before="40" w:after="40" w:line="240" w:lineRule="auto"/>
               <w:jc w:val="center"/>
+              <w:keepNext/>
             </w:pPr>
             <w:r/>
             <w:r>
@@ -6236,6 +6049,7 @@
             <w:pPr>
               <w:spacing w:before="40" w:after="40" w:line="240" w:lineRule="auto"/>
               <w:jc w:val="center"/>
+              <w:keepNext/>
             </w:pPr>
             <w:r/>
             <w:r>
@@ -6287,7 +6101,7 @@
                 <w:rFonts w:ascii="Times New Roman" w:hAnsi="Times New Roman"/>
                 <w:sz w:val="20"/>
               </w:rPr>
-              <w:t>60.48%</w:t>
+              <w:t>0.5544</w:t>
             </w:r>
           </w:p>
         </w:tc>
@@ -6330,7 +6144,7 @@
                 <w:rFonts w:ascii="Times New Roman" w:hAnsi="Times New Roman"/>
                 <w:sz w:val="20"/>
               </w:rPr>
-              <w:t>59.17%</w:t>
+              <w:t>0.54</w:t>
             </w:r>
           </w:p>
         </w:tc>
@@ -6373,7 +6187,7 @@
                 <w:rFonts w:ascii="Times New Roman" w:hAnsi="Times New Roman"/>
                 <w:sz w:val="20"/>
               </w:rPr>
-              <w:t>57.64%</w:t>
+              <w:t>0.4915</w:t>
             </w:r>
           </w:p>
         </w:tc>
@@ -6416,7 +6230,7 @@
                 <w:rFonts w:ascii="Times New Roman" w:hAnsi="Times New Roman"/>
                 <w:sz w:val="20"/>
               </w:rPr>
-              <w:t>58.39%</w:t>
+              <w:t>0.5146</w:t>
             </w:r>
           </w:p>
         </w:tc>
@@ -6428,17 +6242,13 @@
       </w:pPr>
     </w:p>
     <w:p>
-      <w:r>
-        <w:t>KNN achieved the highest accuracy and F1-score, providing a better balance between precision and recall.</w:t>
-      </w:r>
-    </w:p>
-    <w:p>
       <w:pPr>
         <w:pStyle w:val="Heading1"/>
       </w:pPr>
       <w:r>
         <w:rPr>
           <w:rFonts w:ascii="Times New Roman" w:hAnsi="Times New Roman"/>
+          <w:color w:val="000000"/>
           <w:sz w:val="28"/>
         </w:rPr>
         <w:t>7. Phase 5 - Communicate Results: Model Evaluation</w:t>
@@ -6451,14 +6261,15 @@
       <w:r>
         <w:rPr>
           <w:rFonts w:ascii="Times New Roman" w:hAnsi="Times New Roman"/>
+          <w:color w:val="000000"/>
           <w:sz w:val="24"/>
         </w:rPr>
-        <w:t>7.1 Descriptive Statistics and Visualizations</w:t>
+        <w:t>7.1 Descriptive Statistics</w:t>
       </w:r>
     </w:p>
     <w:p>
       <w:r>
-        <w:t>The histogram of ratings reveals a left-skewed distribution with a peak at 4.0. The boxplot confirms the median at 3.5 with an interquartile range from 3.0 to 4.0. The bar plot shows that ratings 4.0 and 5.0 are the most frequent, while lower ratings occur less often.</w:t>
+        <w:t>The histogram of ratings reveals a left-skewed distribution with a peak at 4.0. The boxplot confirms the median at 3.5 with an interquartile range from 3.0 to 4.0. The bar plot shows that ratings 4.0 and 5.0 are the most frequent.</w:t>
       </w:r>
     </w:p>
     <w:p>
@@ -6468,14 +6279,15 @@
       <w:r>
         <w:rPr>
           <w:rFonts w:ascii="Times New Roman" w:hAnsi="Times New Roman"/>
+          <w:color w:val="000000"/>
           <w:sz w:val="24"/>
         </w:rPr>
-        <w:t>7.2 PCA and Dimensionality Reduction</w:t>
+        <w:t>7.2 PCA on Genre Features</w:t>
       </w:r>
     </w:p>
     <w:p>
       <w:r>
-        <w:t>The scree plot indicates that the first few principal components capture the majority of variance. The PCA biplot shows how the original variables contribute to the principal components. Given the small number of features, PCA primarily helps understand variable relationships.</w:t>
+        <w:t>PCA on the 18 genre indicators reveals the underlying correlation structure. The scree plot shows how many components capture meaningful variance. The biplot visualizes which genres are associated with each component.</w:t>
       </w:r>
     </w:p>
     <w:p>
@@ -6485,6 +6297,7 @@
       <w:r>
         <w:rPr>
           <w:rFonts w:ascii="Times New Roman" w:hAnsi="Times New Roman"/>
+          <w:color w:val="000000"/>
           <w:sz w:val="24"/>
         </w:rPr>
         <w:t>7.3 Clustering Results</w:t>
@@ -6492,7 +6305,7 @@
     </w:p>
     <w:p>
       <w:r>
-        <w:t>K-Means with k = 3 produced three distinct clusters visible in the PC1-PC2 projection. The cluster centers plot confirms well-separated centroids, suggesting meaningful grouping of user-movie interactions.</w:t>
+        <w:t>K-Means on movie-level features produced clusters with distinct genre profiles. Cluster centers show which genres define each group, enabling interpretation such as "popular action movies" or "niche drama films."</w:t>
       </w:r>
     </w:p>
     <w:p>
@@ -6502,6 +6315,7 @@
       <w:r>
         <w:rPr>
           <w:rFonts w:ascii="Times New Roman" w:hAnsi="Times New Roman"/>
+          <w:color w:val="000000"/>
           <w:sz w:val="24"/>
         </w:rPr>
         <w:t>7.4 Association Rules</w:t>
@@ -6509,7 +6323,7 @@
     </w:p>
     <w:p>
       <w:r>
-        <w:t>The Apriori algorithm discovered association rules with perfect confidence (1.000) and lift values ranging from 1.85 to 3.30. Rule {5952, 49272} =&gt; {7153} achieved the highest lift of 3.30. These patterns inform recommendation strategies: if a user has watched movies in one itemset, the system can recommend the associated movies.</w:t>
+        <w:t>The Apriori algorithm discovered association rules with perfect confidence and lift values up to 3.30. These patterns reveal movies that users frequently watch together.</w:t>
       </w:r>
     </w:p>
     <w:p>
@@ -6519,6 +6333,7 @@
       <w:r>
         <w:rPr>
           <w:rFonts w:ascii="Times New Roman" w:hAnsi="Times New Roman"/>
+          <w:color w:val="000000"/>
           <w:sz w:val="24"/>
         </w:rPr>
         <w:t>7.5 Regression Performance</w:t>
@@ -6526,7 +6341,7 @@
     </w:p>
     <w:p>
       <w:r>
-        <w:t>The linear regression model produced an MAE of 0.8304 and RMSE of 1.0412. The R-squared value of 0.0024 indicates very limited predictive capability. The residual plot confirms heteroscedasticity and poor model fit. These results suggest that additional features are required for accurate rating prediction.</w:t>
+        <w:t>The genre-based linear regression provides interpretable coefficients showing how each genre influences ratings. The R-squared, MAE, MSE, and RMSE values indicate the predictive power of genre composition.</w:t>
       </w:r>
     </w:p>
     <w:p>
@@ -6536,6 +6351,7 @@
       <w:r>
         <w:rPr>
           <w:rFonts w:ascii="Times New Roman" w:hAnsi="Times New Roman"/>
+          <w:color w:val="000000"/>
           <w:sz w:val="24"/>
         </w:rPr>
         <w:t>7.6 Classification Performance</w:t>
@@ -6549,6 +6365,7 @@
         <w:rPr>
           <w:rFonts w:ascii="Times New Roman" w:hAnsi="Times New Roman"/>
           <w:i/>
+          <w:color w:val="000000"/>
           <w:sz w:val="24"/>
         </w:rPr>
         <w:t>Logistic Regression</w:t>
@@ -6556,7 +6373,7 @@
     </w:p>
     <w:p>
       <w:r>
-        <w:t>The confusion matrix for Logistic Regression: 7,591 true negatives, 2,873 false positives, 6,743 false negatives, and 2,961 true positives. The model achieved 52.32% accuracy but only 30.51% recall on the positive class.</w:t>
+        <w:t>Logistic Regression was trained using all 18 genre indicators as predictors with a binary target (liked = rating &gt;= 4).</w:t>
       </w:r>
     </w:p>
     <w:p>
@@ -6567,6 +6384,7 @@
         <w:rPr>
           <w:rFonts w:ascii="Times New Roman" w:hAnsi="Times New Roman"/>
           <w:i/>
+          <w:color w:val="000000"/>
           <w:sz w:val="24"/>
         </w:rPr>
         <w:t>K-Nearest Neighbors (KNN)</w:t>
@@ -6574,7 +6392,7 @@
     </w:p>
     <w:p>
       <w:r>
-        <w:t>The confusion matrix for KNN: 6,604 true negatives, 3,860 false positives, 4,111 false negatives, and 5,593 true positives. KNN achieved 60.48% accuracy with 57.64% recall, significantly outperforming Logistic Regression.</w:t>
+        <w:t>KNN with k = 5 was applied using standardized genre features to classify liked vs not-liked movies.</w:t>
       </w:r>
     </w:p>
     <w:p>
@@ -6584,6 +6402,7 @@
       <w:r>
         <w:rPr>
           <w:rFonts w:ascii="Times New Roman" w:hAnsi="Times New Roman"/>
+          <w:color w:val="000000"/>
           <w:sz w:val="24"/>
         </w:rPr>
         <w:t>7.7 Performance Comparison</w:t>
@@ -6615,6 +6434,7 @@
             <w:pPr>
               <w:spacing w:before="40" w:after="40" w:line="240" w:lineRule="auto"/>
               <w:jc w:val="center"/>
+              <w:keepNext/>
             </w:pPr>
             <w:r/>
             <w:r>
@@ -6635,6 +6455,7 @@
             <w:pPr>
               <w:spacing w:before="40" w:after="40" w:line="240" w:lineRule="auto"/>
               <w:jc w:val="center"/>
+              <w:keepNext/>
             </w:pPr>
             <w:r/>
             <w:r>
@@ -6655,6 +6476,7 @@
             <w:pPr>
               <w:spacing w:before="40" w:after="40" w:line="240" w:lineRule="auto"/>
               <w:jc w:val="center"/>
+              <w:keepNext/>
             </w:pPr>
             <w:r/>
             <w:r>
@@ -6675,6 +6497,7 @@
             <w:pPr>
               <w:spacing w:before="40" w:after="40" w:line="240" w:lineRule="auto"/>
               <w:jc w:val="center"/>
+              <w:keepNext/>
             </w:pPr>
             <w:r/>
             <w:r>
@@ -6695,6 +6518,7 @@
             <w:pPr>
               <w:spacing w:before="40" w:after="40" w:line="240" w:lineRule="auto"/>
               <w:jc w:val="center"/>
+              <w:keepNext/>
             </w:pPr>
             <w:r/>
             <w:r>
@@ -6746,7 +6570,7 @@
                 <w:rFonts w:ascii="Times New Roman" w:hAnsi="Times New Roman"/>
                 <w:sz w:val="20"/>
               </w:rPr>
-              <w:t>52.32%</w:t>
+              <w:t>0.5713</w:t>
             </w:r>
           </w:p>
         </w:tc>
@@ -6765,7 +6589,7 @@
                 <w:rFonts w:ascii="Times New Roman" w:hAnsi="Times New Roman"/>
                 <w:sz w:val="20"/>
               </w:rPr>
-              <w:t>50.75%</w:t>
+              <w:t>0.5679</w:t>
             </w:r>
           </w:p>
         </w:tc>
@@ -6784,7 +6608,7 @@
                 <w:rFonts w:ascii="Times New Roman" w:hAnsi="Times New Roman"/>
                 <w:sz w:val="20"/>
               </w:rPr>
-              <w:t>30.51%</w:t>
+              <w:t>0.4611</w:t>
             </w:r>
           </w:p>
         </w:tc>
@@ -6803,7 +6627,7 @@
                 <w:rFonts w:ascii="Times New Roman" w:hAnsi="Times New Roman"/>
                 <w:sz w:val="20"/>
               </w:rPr>
-              <w:t>38.11%</w:t>
+              <w:t>0.5089</w:t>
             </w:r>
           </w:p>
         </w:tc>
@@ -6846,7 +6670,7 @@
                 <w:rFonts w:ascii="Times New Roman" w:hAnsi="Times New Roman"/>
                 <w:sz w:val="20"/>
               </w:rPr>
-              <w:t>60.48%</w:t>
+              <w:t>0.5544</w:t>
             </w:r>
           </w:p>
         </w:tc>
@@ -6865,7 +6689,7 @@
                 <w:rFonts w:ascii="Times New Roman" w:hAnsi="Times New Roman"/>
                 <w:sz w:val="20"/>
               </w:rPr>
-              <w:t>59.17%</w:t>
+              <w:t>0.54</w:t>
             </w:r>
           </w:p>
         </w:tc>
@@ -6884,7 +6708,7 @@
                 <w:rFonts w:ascii="Times New Roman" w:hAnsi="Times New Roman"/>
                 <w:sz w:val="20"/>
               </w:rPr>
-              <w:t>57.64%</w:t>
+              <w:t>0.4915</w:t>
             </w:r>
           </w:p>
         </w:tc>
@@ -6903,7 +6727,7 @@
                 <w:rFonts w:ascii="Times New Roman" w:hAnsi="Times New Roman"/>
                 <w:sz w:val="20"/>
               </w:rPr>
-              <w:t>58.39%</w:t>
+              <w:t>0.5146</w:t>
             </w:r>
           </w:p>
         </w:tc>
@@ -6915,17 +6739,13 @@
       </w:pPr>
     </w:p>
     <w:p>
-      <w:r>
-        <w:t>K-Nearest Neighbors (KNN) is selected as the final classification model, achieving the highest performance across all four metrics.</w:t>
-      </w:r>
-    </w:p>
-    <w:p>
       <w:pPr>
         <w:pStyle w:val="Heading1"/>
       </w:pPr>
       <w:r>
         <w:rPr>
           <w:rFonts w:ascii="Times New Roman" w:hAnsi="Times New Roman"/>
+          <w:color w:val="000000"/>
           <w:sz w:val="28"/>
         </w:rPr>
         <w:t>8. Feature Importance and Attribute Selection</w:t>
@@ -6938,6 +6758,7 @@
       <w:r>
         <w:rPr>
           <w:rFonts w:ascii="Times New Roman" w:hAnsi="Times New Roman"/>
+          <w:color w:val="000000"/>
           <w:sz w:val="24"/>
         </w:rPr>
         <w:t>8.1 Filter Method (Correlation Analysis)</w:t>
@@ -6945,429 +6766,7 @@
     </w:p>
     <w:p>
       <w:r>
-        <w:t>A correlation matrix was computed to evaluate linear relationships between numeric variables.</w:t>
-      </w:r>
-    </w:p>
-    <w:tbl>
-      <w:tblPr>
-        <w:tblStyle w:val="LightGrid-Accent1"/>
-        <w:tblW w:type="auto" w:w="0"/>
-        <w:jc w:val="center"/>
-        <w:tblLook w:firstColumn="1" w:firstRow="1" w:lastColumn="0" w:lastRow="0" w:noHBand="0" w:noVBand="1" w:val="04A0"/>
-      </w:tblPr>
-      <w:tblGrid>
-        <w:gridCol w:w="2340"/>
-        <w:gridCol w:w="2340"/>
-        <w:gridCol w:w="2340"/>
-        <w:gridCol w:w="2340"/>
-      </w:tblGrid>
-      <w:tr>
-        <w:trPr>
-          <w:cantSplit/>
-        </w:trPr>
-        <w:tc>
-          <w:tcPr>
-            <w:tcW w:type="dxa" w:w="2340"/>
-          </w:tcPr>
-          <w:p>
-            <w:pPr>
-              <w:spacing w:before="40" w:after="40" w:line="240" w:lineRule="auto"/>
-              <w:jc w:val="center"/>
-            </w:pPr>
-            <w:r/>
-            <w:r>
-              <w:rPr>
-                <w:rFonts w:ascii="Times New Roman" w:hAnsi="Times New Roman"/>
-                <w:b/>
-                <w:sz w:val="20"/>
-              </w:rPr>
-            </w:r>
-          </w:p>
-        </w:tc>
-        <w:tc>
-          <w:tcPr>
-            <w:tcW w:type="dxa" w:w="2340"/>
-          </w:tcPr>
-          <w:p>
-            <w:pPr>
-              <w:spacing w:before="40" w:after="40" w:line="240" w:lineRule="auto"/>
-              <w:jc w:val="center"/>
-            </w:pPr>
-            <w:r/>
-            <w:r>
-              <w:rPr>
-                <w:rFonts w:ascii="Times New Roman" w:hAnsi="Times New Roman"/>
-                <w:b/>
-                <w:sz w:val="20"/>
-              </w:rPr>
-              <w:t>userId</w:t>
-            </w:r>
-          </w:p>
-        </w:tc>
-        <w:tc>
-          <w:tcPr>
-            <w:tcW w:type="dxa" w:w="2340"/>
-          </w:tcPr>
-          <w:p>
-            <w:pPr>
-              <w:spacing w:before="40" w:after="40" w:line="240" w:lineRule="auto"/>
-              <w:jc w:val="center"/>
-            </w:pPr>
-            <w:r/>
-            <w:r>
-              <w:rPr>
-                <w:rFonts w:ascii="Times New Roman" w:hAnsi="Times New Roman"/>
-                <w:b/>
-                <w:sz w:val="20"/>
-              </w:rPr>
-              <w:t>movieId</w:t>
-            </w:r>
-          </w:p>
-        </w:tc>
-        <w:tc>
-          <w:tcPr>
-            <w:tcW w:type="dxa" w:w="2340"/>
-          </w:tcPr>
-          <w:p>
-            <w:pPr>
-              <w:spacing w:before="40" w:after="40" w:line="240" w:lineRule="auto"/>
-              <w:jc w:val="center"/>
-            </w:pPr>
-            <w:r/>
-            <w:r>
-              <w:rPr>
-                <w:rFonts w:ascii="Times New Roman" w:hAnsi="Times New Roman"/>
-                <w:b/>
-                <w:sz w:val="20"/>
-              </w:rPr>
-              <w:t>rating</w:t>
-            </w:r>
-          </w:p>
-        </w:tc>
-      </w:tr>
-      <w:tr>
-        <w:trPr>
-          <w:cantSplit/>
-        </w:trPr>
-        <w:tc>
-          <w:tcPr>
-            <w:tcW w:type="dxa" w:w="2340"/>
-          </w:tcPr>
-          <w:p>
-            <w:pPr>
-              <w:spacing w:before="20" w:after="20" w:line="240" w:lineRule="auto"/>
-              <w:jc w:val="center"/>
-            </w:pPr>
-            <w:r/>
-            <w:r>
-              <w:rPr>
-                <w:rFonts w:ascii="Times New Roman" w:hAnsi="Times New Roman"/>
-                <w:sz w:val="20"/>
-              </w:rPr>
-              <w:t>userId</w:t>
-            </w:r>
-          </w:p>
-        </w:tc>
-        <w:tc>
-          <w:tcPr>
-            <w:tcW w:type="dxa" w:w="2340"/>
-          </w:tcPr>
-          <w:p>
-            <w:pPr>
-              <w:spacing w:before="20" w:after="20" w:line="240" w:lineRule="auto"/>
-              <w:jc w:val="center"/>
-            </w:pPr>
-            <w:r/>
-            <w:r>
-              <w:rPr>
-                <w:rFonts w:ascii="Times New Roman" w:hAnsi="Times New Roman"/>
-                <w:sz w:val="20"/>
-              </w:rPr>
-              <w:t>1.000000</w:t>
-            </w:r>
-          </w:p>
-        </w:tc>
-        <w:tc>
-          <w:tcPr>
-            <w:tcW w:type="dxa" w:w="2340"/>
-          </w:tcPr>
-          <w:p>
-            <w:pPr>
-              <w:spacing w:before="20" w:after="20" w:line="240" w:lineRule="auto"/>
-              <w:jc w:val="center"/>
-            </w:pPr>
-            <w:r/>
-            <w:r>
-              <w:rPr>
-                <w:rFonts w:ascii="Times New Roman" w:hAnsi="Times New Roman"/>
-                <w:sz w:val="20"/>
-              </w:rPr>
-              <w:t>0.006773</w:t>
-            </w:r>
-          </w:p>
-        </w:tc>
-        <w:tc>
-          <w:tcPr>
-            <w:tcW w:type="dxa" w:w="2340"/>
-          </w:tcPr>
-          <w:p>
-            <w:pPr>
-              <w:spacing w:before="20" w:after="20" w:line="240" w:lineRule="auto"/>
-              <w:jc w:val="center"/>
-            </w:pPr>
-            <w:r/>
-            <w:r>
-              <w:rPr>
-                <w:rFonts w:ascii="Times New Roman" w:hAnsi="Times New Roman"/>
-                <w:sz w:val="20"/>
-              </w:rPr>
-              <w:t>-0.049348</w:t>
-            </w:r>
-          </w:p>
-        </w:tc>
-      </w:tr>
-      <w:tr>
-        <w:trPr>
-          <w:cantSplit/>
-        </w:trPr>
-        <w:tc>
-          <w:tcPr>
-            <w:tcW w:type="dxa" w:w="2340"/>
-          </w:tcPr>
-          <w:p>
-            <w:pPr>
-              <w:spacing w:before="20" w:after="20" w:line="240" w:lineRule="auto"/>
-              <w:jc w:val="center"/>
-            </w:pPr>
-            <w:r/>
-            <w:r>
-              <w:rPr>
-                <w:rFonts w:ascii="Times New Roman" w:hAnsi="Times New Roman"/>
-                <w:sz w:val="20"/>
-              </w:rPr>
-              <w:t>movieId</w:t>
-            </w:r>
-          </w:p>
-        </w:tc>
-        <w:tc>
-          <w:tcPr>
-            <w:tcW w:type="dxa" w:w="2340"/>
-          </w:tcPr>
-          <w:p>
-            <w:pPr>
-              <w:spacing w:before="20" w:after="20" w:line="240" w:lineRule="auto"/>
-              <w:jc w:val="center"/>
-            </w:pPr>
-            <w:r/>
-            <w:r>
-              <w:rPr>
-                <w:rFonts w:ascii="Times New Roman" w:hAnsi="Times New Roman"/>
-                <w:sz w:val="20"/>
-              </w:rPr>
-              <w:t>0.006773</w:t>
-            </w:r>
-          </w:p>
-        </w:tc>
-        <w:tc>
-          <w:tcPr>
-            <w:tcW w:type="dxa" w:w="2340"/>
-          </w:tcPr>
-          <w:p>
-            <w:pPr>
-              <w:spacing w:before="20" w:after="20" w:line="240" w:lineRule="auto"/>
-              <w:jc w:val="center"/>
-            </w:pPr>
-            <w:r/>
-            <w:r>
-              <w:rPr>
-                <w:rFonts w:ascii="Times New Roman" w:hAnsi="Times New Roman"/>
-                <w:sz w:val="20"/>
-              </w:rPr>
-              <w:t>1.000000</w:t>
-            </w:r>
-          </w:p>
-        </w:tc>
-        <w:tc>
-          <w:tcPr>
-            <w:tcW w:type="dxa" w:w="2340"/>
-          </w:tcPr>
-          <w:p>
-            <w:pPr>
-              <w:spacing w:before="20" w:after="20" w:line="240" w:lineRule="auto"/>
-              <w:jc w:val="center"/>
-            </w:pPr>
-            <w:r/>
-            <w:r>
-              <w:rPr>
-                <w:rFonts w:ascii="Times New Roman" w:hAnsi="Times New Roman"/>
-                <w:sz w:val="20"/>
-              </w:rPr>
-              <w:t>-0.004061</w:t>
-            </w:r>
-          </w:p>
-        </w:tc>
-      </w:tr>
-      <w:tr>
-        <w:trPr>
-          <w:cantSplit/>
-        </w:trPr>
-        <w:tc>
-          <w:tcPr>
-            <w:tcW w:type="dxa" w:w="2340"/>
-          </w:tcPr>
-          <w:p>
-            <w:pPr>
-              <w:spacing w:before="20" w:after="20" w:line="240" w:lineRule="auto"/>
-              <w:jc w:val="center"/>
-            </w:pPr>
-            <w:r/>
-            <w:r>
-              <w:rPr>
-                <w:rFonts w:ascii="Times New Roman" w:hAnsi="Times New Roman"/>
-                <w:sz w:val="20"/>
-              </w:rPr>
-              <w:t>rating</w:t>
-            </w:r>
-          </w:p>
-        </w:tc>
-        <w:tc>
-          <w:tcPr>
-            <w:tcW w:type="dxa" w:w="2340"/>
-          </w:tcPr>
-          <w:p>
-            <w:pPr>
-              <w:spacing w:before="20" w:after="20" w:line="240" w:lineRule="auto"/>
-              <w:jc w:val="center"/>
-            </w:pPr>
-            <w:r/>
-            <w:r>
-              <w:rPr>
-                <w:rFonts w:ascii="Times New Roman" w:hAnsi="Times New Roman"/>
-                <w:sz w:val="20"/>
-              </w:rPr>
-              <w:t>-0.049348</w:t>
-            </w:r>
-          </w:p>
-        </w:tc>
-        <w:tc>
-          <w:tcPr>
-            <w:tcW w:type="dxa" w:w="2340"/>
-          </w:tcPr>
-          <w:p>
-            <w:pPr>
-              <w:spacing w:before="20" w:after="20" w:line="240" w:lineRule="auto"/>
-              <w:jc w:val="center"/>
-            </w:pPr>
-            <w:r/>
-            <w:r>
-              <w:rPr>
-                <w:rFonts w:ascii="Times New Roman" w:hAnsi="Times New Roman"/>
-                <w:sz w:val="20"/>
-              </w:rPr>
-              <w:t>-0.004061</w:t>
-            </w:r>
-          </w:p>
-        </w:tc>
-        <w:tc>
-          <w:tcPr>
-            <w:tcW w:type="dxa" w:w="2340"/>
-          </w:tcPr>
-          <w:p>
-            <w:pPr>
-              <w:spacing w:before="20" w:after="20" w:line="240" w:lineRule="auto"/>
-              <w:jc w:val="center"/>
-            </w:pPr>
-            <w:r/>
-            <w:r>
-              <w:rPr>
-                <w:rFonts w:ascii="Times New Roman" w:hAnsi="Times New Roman"/>
-                <w:sz w:val="20"/>
-              </w:rPr>
-              <w:t>1.000000</w:t>
-            </w:r>
-          </w:p>
-        </w:tc>
-      </w:tr>
-    </w:tbl>
-    <w:p>
-      <w:pPr>
-        <w:spacing w:before="40" w:after="40"/>
-      </w:pPr>
-    </w:p>
-    <w:p>
-      <w:pPr>
-        <w:spacing w:before="120" w:after="40" w:line="240" w:lineRule="auto"/>
-        <w:jc w:val="center"/>
-      </w:pPr>
-      <w:r>
-        <w:drawing>
-          <wp:inline xmlns:a="http://schemas.openxmlformats.org/drawingml/2006/main" xmlns:pic="http://schemas.openxmlformats.org/drawingml/2006/picture">
-            <wp:extent cx="4572000" cy="3429000"/>
-            <wp:docPr id="10" name="Picture 10"/>
-            <wp:cNvGraphicFramePr>
-              <a:graphicFrameLocks noChangeAspect="1"/>
-            </wp:cNvGraphicFramePr>
-            <a:graphic>
-              <a:graphicData uri="http://schemas.openxmlformats.org/drawingml/2006/picture">
-                <pic:pic>
-                  <pic:nvPicPr>
-                    <pic:cNvPr id="0" name="correlation_matrix.png"/>
-                    <pic:cNvPicPr/>
-                  </pic:nvPicPr>
-                  <pic:blipFill>
-                    <a:blip r:embed="rId19"/>
-                    <a:stretch>
-                      <a:fillRect/>
-                    </a:stretch>
-                  </pic:blipFill>
-                  <pic:spPr>
-                    <a:xfrm>
-                      <a:off x="0" y="0"/>
-                      <a:ext cx="4572000" cy="3429000"/>
-                    </a:xfrm>
-                    <a:prstGeom prst="rect"/>
-                  </pic:spPr>
-                </pic:pic>
-              </a:graphicData>
-            </a:graphic>
-          </wp:inline>
-        </w:drawing>
-      </w:r>
-    </w:p>
-    <w:p>
-      <w:pPr>
-        <w:spacing w:before="40" w:after="120" w:line="240" w:lineRule="auto"/>
-        <w:jc w:val="center"/>
-      </w:pPr>
-      <w:r>
-        <w:rPr>
-          <w:rFonts w:ascii="Times New Roman" w:hAnsi="Times New Roman"/>
-          <w:i/>
-          <w:sz w:val="20"/>
-        </w:rPr>
-        <w:t>Figure 5.1 - Correlation matrix heatmap showing weak relationships between predictors and rating.</w:t>
-      </w:r>
-    </w:p>
-    <w:p>
-      <w:r>
-        <w:t>Both userId and movieId exhibit very weak linear relationships with rating, suggesting limited predictive value.</w:t>
-      </w:r>
-    </w:p>
-    <w:p>
-      <w:pPr>
-        <w:pStyle w:val="Heading2"/>
-      </w:pPr>
-      <w:r>
-        <w:rPr>
-          <w:rFonts w:ascii="Times New Roman" w:hAnsi="Times New Roman"/>
-          <w:sz w:val="24"/>
-        </w:rPr>
-        <w:t>8.2 Wrapper Method (Stepwise Regression)</w:t>
-      </w:r>
-    </w:p>
-    <w:p>
-      <w:r>
-        <w:t>Stepwise regression selected only userId as a significant predictor, removing movieId from the model.</w:t>
+        <w:t>A correlation matrix was computed between the rating variable and all 18 genre indicators. This identifies which genres have the strongest linear relationship with ratings.</w:t>
       </w:r>
     </w:p>
     <w:tbl>
@@ -7393,6 +6792,358 @@
             <w:pPr>
               <w:spacing w:before="40" w:after="40" w:line="240" w:lineRule="auto"/>
               <w:jc w:val="center"/>
+              <w:keepNext/>
+            </w:pPr>
+            <w:r/>
+            <w:r>
+              <w:rPr>
+                <w:rFonts w:ascii="Times New Roman" w:hAnsi="Times New Roman"/>
+                <w:b/>
+                <w:sz w:val="20"/>
+              </w:rPr>
+              <w:t>Genre</w:t>
+            </w:r>
+          </w:p>
+        </w:tc>
+        <w:tc>
+          <w:tcPr>
+            <w:tcW w:type="dxa" w:w="4680"/>
+          </w:tcPr>
+          <w:p>
+            <w:pPr>
+              <w:spacing w:before="40" w:after="40" w:line="240" w:lineRule="auto"/>
+              <w:jc w:val="center"/>
+              <w:keepNext/>
+            </w:pPr>
+            <w:r/>
+            <w:r>
+              <w:rPr>
+                <w:rFonts w:ascii="Times New Roman" w:hAnsi="Times New Roman"/>
+                <w:b/>
+                <w:sz w:val="20"/>
+              </w:rPr>
+              <w:t>Correlation with Rating</w:t>
+            </w:r>
+          </w:p>
+        </w:tc>
+      </w:tr>
+      <w:tr>
+        <w:trPr>
+          <w:cantSplit/>
+        </w:trPr>
+        <w:tc>
+          <w:tcPr>
+            <w:tcW w:type="dxa" w:w="4680"/>
+          </w:tcPr>
+          <w:p>
+            <w:pPr>
+              <w:spacing w:before="20" w:after="20" w:line="240" w:lineRule="auto"/>
+              <w:jc w:val="center"/>
+            </w:pPr>
+            <w:r/>
+            <w:r>
+              <w:rPr>
+                <w:rFonts w:ascii="Times New Roman" w:hAnsi="Times New Roman"/>
+                <w:sz w:val="20"/>
+              </w:rPr>
+              <w:t>Drama</w:t>
+            </w:r>
+          </w:p>
+        </w:tc>
+        <w:tc>
+          <w:tcPr>
+            <w:tcW w:type="dxa" w:w="4680"/>
+          </w:tcPr>
+          <w:p>
+            <w:pPr>
+              <w:spacing w:before="20" w:after="20" w:line="240" w:lineRule="auto"/>
+              <w:jc w:val="center"/>
+            </w:pPr>
+            <w:r/>
+            <w:r>
+              <w:rPr>
+                <w:rFonts w:ascii="Times New Roman" w:hAnsi="Times New Roman"/>
+                <w:sz w:val="20"/>
+              </w:rPr>
+              <w:t>0.1251</w:t>
+            </w:r>
+          </w:p>
+        </w:tc>
+      </w:tr>
+      <w:tr>
+        <w:trPr>
+          <w:cantSplit/>
+        </w:trPr>
+        <w:tc>
+          <w:tcPr>
+            <w:tcW w:type="dxa" w:w="4680"/>
+          </w:tcPr>
+          <w:p>
+            <w:pPr>
+              <w:spacing w:before="20" w:after="20" w:line="240" w:lineRule="auto"/>
+              <w:jc w:val="center"/>
+            </w:pPr>
+            <w:r/>
+            <w:r>
+              <w:rPr>
+                <w:rFonts w:ascii="Times New Roman" w:hAnsi="Times New Roman"/>
+                <w:sz w:val="20"/>
+              </w:rPr>
+              <w:t>Comedy</w:t>
+            </w:r>
+          </w:p>
+        </w:tc>
+        <w:tc>
+          <w:tcPr>
+            <w:tcW w:type="dxa" w:w="4680"/>
+          </w:tcPr>
+          <w:p>
+            <w:pPr>
+              <w:spacing w:before="20" w:after="20" w:line="240" w:lineRule="auto"/>
+              <w:jc w:val="center"/>
+            </w:pPr>
+            <w:r/>
+            <w:r>
+              <w:rPr>
+                <w:rFonts w:ascii="Times New Roman" w:hAnsi="Times New Roman"/>
+                <w:sz w:val="20"/>
+              </w:rPr>
+              <w:t>-0.0891</w:t>
+            </w:r>
+          </w:p>
+        </w:tc>
+      </w:tr>
+      <w:tr>
+        <w:trPr>
+          <w:cantSplit/>
+        </w:trPr>
+        <w:tc>
+          <w:tcPr>
+            <w:tcW w:type="dxa" w:w="4680"/>
+          </w:tcPr>
+          <w:p>
+            <w:pPr>
+              <w:spacing w:before="20" w:after="20" w:line="240" w:lineRule="auto"/>
+              <w:jc w:val="center"/>
+            </w:pPr>
+            <w:r/>
+            <w:r>
+              <w:rPr>
+                <w:rFonts w:ascii="Times New Roman" w:hAnsi="Times New Roman"/>
+                <w:sz w:val="20"/>
+              </w:rPr>
+              <w:t>Crime</w:t>
+            </w:r>
+          </w:p>
+        </w:tc>
+        <w:tc>
+          <w:tcPr>
+            <w:tcW w:type="dxa" w:w="4680"/>
+          </w:tcPr>
+          <w:p>
+            <w:pPr>
+              <w:spacing w:before="20" w:after="20" w:line="240" w:lineRule="auto"/>
+              <w:jc w:val="center"/>
+            </w:pPr>
+            <w:r/>
+            <w:r>
+              <w:rPr>
+                <w:rFonts w:ascii="Times New Roman" w:hAnsi="Times New Roman"/>
+                <w:sz w:val="20"/>
+              </w:rPr>
+              <w:t>0.0669</w:t>
+            </w:r>
+          </w:p>
+        </w:tc>
+      </w:tr>
+      <w:tr>
+        <w:trPr>
+          <w:cantSplit/>
+        </w:trPr>
+        <w:tc>
+          <w:tcPr>
+            <w:tcW w:type="dxa" w:w="4680"/>
+          </w:tcPr>
+          <w:p>
+            <w:pPr>
+              <w:spacing w:before="20" w:after="20" w:line="240" w:lineRule="auto"/>
+              <w:jc w:val="center"/>
+            </w:pPr>
+            <w:r/>
+            <w:r>
+              <w:rPr>
+                <w:rFonts w:ascii="Times New Roman" w:hAnsi="Times New Roman"/>
+                <w:sz w:val="20"/>
+              </w:rPr>
+              <w:t>War</w:t>
+            </w:r>
+          </w:p>
+        </w:tc>
+        <w:tc>
+          <w:tcPr>
+            <w:tcW w:type="dxa" w:w="4680"/>
+          </w:tcPr>
+          <w:p>
+            <w:pPr>
+              <w:spacing w:before="20" w:after="20" w:line="240" w:lineRule="auto"/>
+              <w:jc w:val="center"/>
+            </w:pPr>
+            <w:r/>
+            <w:r>
+              <w:rPr>
+                <w:rFonts w:ascii="Times New Roman" w:hAnsi="Times New Roman"/>
+                <w:sz w:val="20"/>
+              </w:rPr>
+              <w:t>0.0662</w:t>
+            </w:r>
+          </w:p>
+        </w:tc>
+      </w:tr>
+      <w:tr>
+        <w:trPr>
+          <w:cantSplit/>
+        </w:trPr>
+        <w:tc>
+          <w:tcPr>
+            <w:tcW w:type="dxa" w:w="4680"/>
+          </w:tcPr>
+          <w:p>
+            <w:pPr>
+              <w:spacing w:before="20" w:after="20" w:line="240" w:lineRule="auto"/>
+              <w:jc w:val="center"/>
+            </w:pPr>
+            <w:r/>
+            <w:r>
+              <w:rPr>
+                <w:rFonts w:ascii="Times New Roman" w:hAnsi="Times New Roman"/>
+                <w:sz w:val="20"/>
+              </w:rPr>
+              <w:t>Horror</w:t>
+            </w:r>
+          </w:p>
+        </w:tc>
+        <w:tc>
+          <w:tcPr>
+            <w:tcW w:type="dxa" w:w="4680"/>
+          </w:tcPr>
+          <w:p>
+            <w:pPr>
+              <w:spacing w:before="20" w:after="20" w:line="240" w:lineRule="auto"/>
+              <w:jc w:val="center"/>
+            </w:pPr>
+            <w:r/>
+            <w:r>
+              <w:rPr>
+                <w:rFonts w:ascii="Times New Roman" w:hAnsi="Times New Roman"/>
+                <w:sz w:val="20"/>
+              </w:rPr>
+              <w:t>-0.0652</w:t>
+            </w:r>
+          </w:p>
+        </w:tc>
+      </w:tr>
+    </w:tbl>
+    <w:p>
+      <w:pPr>
+        <w:spacing w:before="40" w:after="40"/>
+      </w:pPr>
+    </w:p>
+    <w:p>
+      <w:pPr>
+        <w:spacing w:before="120" w:after="40" w:line="240" w:lineRule="auto"/>
+        <w:jc w:val="center"/>
+      </w:pPr>
+      <w:r>
+        <w:drawing>
+          <wp:inline xmlns:a="http://schemas.openxmlformats.org/drawingml/2006/main" xmlns:pic="http://schemas.openxmlformats.org/drawingml/2006/picture">
+            <wp:extent cx="4572000" cy="4114800"/>
+            <wp:docPr id="10" name="Picture 10"/>
+            <wp:cNvGraphicFramePr>
+              <a:graphicFrameLocks noChangeAspect="1"/>
+            </wp:cNvGraphicFramePr>
+            <a:graphic>
+              <a:graphicData uri="http://schemas.openxmlformats.org/drawingml/2006/picture">
+                <pic:pic>
+                  <pic:nvPicPr>
+                    <pic:cNvPr id="0" name="correlation_matrix.png"/>
+                    <pic:cNvPicPr/>
+                  </pic:nvPicPr>
+                  <pic:blipFill>
+                    <a:blip r:embed="rId19"/>
+                    <a:stretch>
+                      <a:fillRect/>
+                    </a:stretch>
+                  </pic:blipFill>
+                  <pic:spPr>
+                    <a:xfrm>
+                      <a:off x="0" y="0"/>
+                      <a:ext cx="4572000" cy="4114800"/>
+                    </a:xfrm>
+                    <a:prstGeom prst="rect"/>
+                  </pic:spPr>
+                </pic:pic>
+              </a:graphicData>
+            </a:graphic>
+          </wp:inline>
+        </w:drawing>
+      </w:r>
+    </w:p>
+    <w:p>
+      <w:pPr>
+        <w:spacing w:before="40" w:after="120" w:line="240" w:lineRule="auto"/>
+        <w:jc w:val="center"/>
+      </w:pPr>
+      <w:r>
+        <w:rPr>
+          <w:rFonts w:ascii="Times New Roman" w:hAnsi="Times New Roman"/>
+          <w:i/>
+          <w:sz w:val="20"/>
+        </w:rPr>
+        <w:t>Figure 5.1 - Correlation matrix heatmap of rating and 18 genre indicators.</w:t>
+      </w:r>
+    </w:p>
+    <w:p>
+      <w:pPr>
+        <w:pStyle w:val="Heading2"/>
+      </w:pPr>
+      <w:r>
+        <w:rPr>
+          <w:rFonts w:ascii="Times New Roman" w:hAnsi="Times New Roman"/>
+          <w:color w:val="000000"/>
+          <w:sz w:val="24"/>
+        </w:rPr>
+        <w:t>8.2 Wrapper Method (Stepwise Regression)</w:t>
+      </w:r>
+    </w:p>
+    <w:p>
+      <w:r>
+        <w:t>Stepwise regression selected a subset of genre indicators that best predict ratings, trading off model complexity against explanatory power.</w:t>
+      </w:r>
+    </w:p>
+    <w:tbl>
+      <w:tblPr>
+        <w:tblStyle w:val="LightGrid-Accent1"/>
+        <w:tblW w:type="auto" w:w="0"/>
+        <w:jc w:val="center"/>
+        <w:tblLook w:firstColumn="1" w:firstRow="1" w:lastColumn="0" w:lastRow="0" w:noHBand="0" w:noVBand="1" w:val="04A0"/>
+      </w:tblPr>
+      <w:tblGrid>
+        <w:gridCol w:w="4680"/>
+        <w:gridCol w:w="4680"/>
+      </w:tblGrid>
+      <w:tr>
+        <w:trPr>
+          <w:cantSplit/>
+        </w:trPr>
+        <w:tc>
+          <w:tcPr>
+            <w:tcW w:type="dxa" w:w="4680"/>
+          </w:tcPr>
+          <w:p>
+            <w:pPr>
+              <w:spacing w:before="40" w:after="40" w:line="240" w:lineRule="auto"/>
+              <w:jc w:val="center"/>
+              <w:keepNext/>
             </w:pPr>
             <w:r/>
             <w:r>
@@ -7413,6 +7164,7 @@
             <w:pPr>
               <w:spacing w:before="40" w:after="40" w:line="240" w:lineRule="auto"/>
               <w:jc w:val="center"/>
+              <w:keepNext/>
             </w:pPr>
             <w:r/>
             <w:r>
@@ -7445,7 +7197,7 @@
                 <w:rFonts w:ascii="Times New Roman" w:hAnsi="Times New Roman"/>
                 <w:sz w:val="20"/>
               </w:rPr>
-              <w:t>Final Formula</w:t>
+              <w:t>Starting Model</w:t>
             </w:r>
           </w:p>
         </w:tc>
@@ -7464,7 +7216,7 @@
                 <w:rFonts w:ascii="Times New Roman" w:hAnsi="Times New Roman"/>
                 <w:sz w:val="20"/>
               </w:rPr>
-              <w:t>rating ~ userId</w:t>
+              <w:t>rating ~ all 18 genres</w:t>
             </w:r>
           </w:p>
         </w:tc>
@@ -7488,7 +7240,7 @@
                 <w:rFonts w:ascii="Times New Roman" w:hAnsi="Times New Roman"/>
                 <w:sz w:val="20"/>
               </w:rPr>
-              <w:t>Intercept</w:t>
+              <w:t>Selected Features</w:t>
             </w:r>
           </w:p>
         </w:tc>
@@ -7507,7 +7259,7 @@
                 <w:rFonts w:ascii="Times New Roman" w:hAnsi="Times New Roman"/>
                 <w:sz w:val="20"/>
               </w:rPr>
-              <w:t>3.593</w:t>
+              <w:t>Drama, Comedy, Horror, Crime, Animation, Children, War, Action, Adventure, Documentary, Mystery, Thriller, Musical, Fantasy, Western, Romance</w:t>
             </w:r>
           </w:p>
         </w:tc>
@@ -7531,7 +7283,7 @@
                 <w:rFonts w:ascii="Times New Roman" w:hAnsi="Times New Roman"/>
                 <w:sz w:val="20"/>
               </w:rPr>
-              <w:t>userId Coefficient</w:t>
+              <w:t>R-squared</w:t>
             </w:r>
           </w:p>
         </w:tc>
@@ -7550,179 +7302,7 @@
                 <w:rFonts w:ascii="Times New Roman" w:hAnsi="Times New Roman"/>
                 <w:sz w:val="20"/>
               </w:rPr>
-              <w:t>-0.0002817</w:t>
-            </w:r>
-          </w:p>
-        </w:tc>
-      </w:tr>
-      <w:tr>
-        <w:trPr>
-          <w:cantSplit/>
-        </w:trPr>
-        <w:tc>
-          <w:tcPr>
-            <w:tcW w:type="dxa" w:w="4680"/>
-          </w:tcPr>
-          <w:p>
-            <w:pPr>
-              <w:spacing w:before="20" w:after="20" w:line="240" w:lineRule="auto"/>
-              <w:jc w:val="center"/>
-            </w:pPr>
-            <w:r/>
-            <w:r>
-              <w:rPr>
-                <w:rFonts w:ascii="Times New Roman" w:hAnsi="Times New Roman"/>
-                <w:sz w:val="20"/>
-              </w:rPr>
-              <w:t>Residual Std Error</w:t>
-            </w:r>
-          </w:p>
-        </w:tc>
-        <w:tc>
-          <w:tcPr>
-            <w:tcW w:type="dxa" w:w="4680"/>
-          </w:tcPr>
-          <w:p>
-            <w:pPr>
-              <w:spacing w:before="20" w:after="20" w:line="240" w:lineRule="auto"/>
-              <w:jc w:val="center"/>
-            </w:pPr>
-            <w:r/>
-            <w:r>
-              <w:rPr>
-                <w:rFonts w:ascii="Times New Roman" w:hAnsi="Times New Roman"/>
-                <w:sz w:val="20"/>
-              </w:rPr>
-              <w:t>1.041</w:t>
-            </w:r>
-          </w:p>
-        </w:tc>
-      </w:tr>
-      <w:tr>
-        <w:trPr>
-          <w:cantSplit/>
-        </w:trPr>
-        <w:tc>
-          <w:tcPr>
-            <w:tcW w:type="dxa" w:w="4680"/>
-          </w:tcPr>
-          <w:p>
-            <w:pPr>
-              <w:spacing w:before="20" w:after="20" w:line="240" w:lineRule="auto"/>
-              <w:jc w:val="center"/>
-            </w:pPr>
-            <w:r/>
-            <w:r>
-              <w:rPr>
-                <w:rFonts w:ascii="Times New Roman" w:hAnsi="Times New Roman"/>
-                <w:sz w:val="20"/>
-              </w:rPr>
-              <w:t>Multiple R-squared</w:t>
-            </w:r>
-          </w:p>
-        </w:tc>
-        <w:tc>
-          <w:tcPr>
-            <w:tcW w:type="dxa" w:w="4680"/>
-          </w:tcPr>
-          <w:p>
-            <w:pPr>
-              <w:spacing w:before="20" w:after="20" w:line="240" w:lineRule="auto"/>
-              <w:jc w:val="center"/>
-            </w:pPr>
-            <w:r/>
-            <w:r>
-              <w:rPr>
-                <w:rFonts w:ascii="Times New Roman" w:hAnsi="Times New Roman"/>
-                <w:sz w:val="20"/>
-              </w:rPr>
-              <w:t>0.002435</w:t>
-            </w:r>
-          </w:p>
-        </w:tc>
-      </w:tr>
-      <w:tr>
-        <w:trPr>
-          <w:cantSplit/>
-        </w:trPr>
-        <w:tc>
-          <w:tcPr>
-            <w:tcW w:type="dxa" w:w="4680"/>
-          </w:tcPr>
-          <w:p>
-            <w:pPr>
-              <w:spacing w:before="20" w:after="20" w:line="240" w:lineRule="auto"/>
-              <w:jc w:val="center"/>
-            </w:pPr>
-            <w:r/>
-            <w:r>
-              <w:rPr>
-                <w:rFonts w:ascii="Times New Roman" w:hAnsi="Times New Roman"/>
-                <w:sz w:val="20"/>
-              </w:rPr>
-              <w:t>F-statistic</w:t>
-            </w:r>
-          </w:p>
-        </w:tc>
-        <w:tc>
-          <w:tcPr>
-            <w:tcW w:type="dxa" w:w="4680"/>
-          </w:tcPr>
-          <w:p>
-            <w:pPr>
-              <w:spacing w:before="20" w:after="20" w:line="240" w:lineRule="auto"/>
-              <w:jc w:val="center"/>
-            </w:pPr>
-            <w:r/>
-            <w:r>
-              <w:rPr>
-                <w:rFonts w:ascii="Times New Roman" w:hAnsi="Times New Roman"/>
-                <w:sz w:val="20"/>
-              </w:rPr>
-              <w:t>246.2</w:t>
-            </w:r>
-          </w:p>
-        </w:tc>
-      </w:tr>
-      <w:tr>
-        <w:trPr>
-          <w:cantSplit/>
-        </w:trPr>
-        <w:tc>
-          <w:tcPr>
-            <w:tcW w:type="dxa" w:w="4680"/>
-          </w:tcPr>
-          <w:p>
-            <w:pPr>
-              <w:spacing w:before="20" w:after="20" w:line="240" w:lineRule="auto"/>
-              <w:jc w:val="center"/>
-            </w:pPr>
-            <w:r/>
-            <w:r>
-              <w:rPr>
-                <w:rFonts w:ascii="Times New Roman" w:hAnsi="Times New Roman"/>
-                <w:sz w:val="20"/>
-              </w:rPr>
-              <w:t>p-value</w:t>
-            </w:r>
-          </w:p>
-        </w:tc>
-        <w:tc>
-          <w:tcPr>
-            <w:tcW w:type="dxa" w:w="4680"/>
-          </w:tcPr>
-          <w:p>
-            <w:pPr>
-              <w:spacing w:before="20" w:after="20" w:line="240" w:lineRule="auto"/>
-              <w:jc w:val="center"/>
-            </w:pPr>
-            <w:r/>
-            <w:r>
-              <w:rPr>
-                <w:rFonts w:ascii="Times New Roman" w:hAnsi="Times New Roman"/>
-                <w:sz w:val="20"/>
-              </w:rPr>
-              <w:t>&lt; 2.2e-16</w:t>
+              <w:t>0.0385</w:t>
             </w:r>
           </w:p>
         </w:tc>
@@ -7734,17 +7314,13 @@
       </w:pPr>
     </w:p>
     <w:p>
-      <w:r>
-        <w:t>Richer feature engineering is needed for effective recommendation, including genre encoding, user history statistics, temporal features, or content-based attributes.</w:t>
-      </w:r>
-    </w:p>
-    <w:p>
       <w:pPr>
         <w:pStyle w:val="Heading1"/>
       </w:pPr>
       <w:r>
         <w:rPr>
           <w:rFonts w:ascii="Times New Roman" w:hAnsi="Times New Roman"/>
+          <w:color w:val="000000"/>
           <w:sz w:val="28"/>
         </w:rPr>
         <w:t>9. Statistical Tests and Hypothesis Validation</w:t>
@@ -7757,6 +7333,7 @@
       <w:r>
         <w:rPr>
           <w:rFonts w:ascii="Times New Roman" w:hAnsi="Times New Roman"/>
+          <w:color w:val="000000"/>
           <w:sz w:val="24"/>
         </w:rPr>
         <w:t>9.1 t-Test (Difference of Means)</w:t>
@@ -7790,6 +7367,7 @@
             <w:pPr>
               <w:spacing w:before="40" w:after="40" w:line="240" w:lineRule="auto"/>
               <w:jc w:val="center"/>
+              <w:keepNext/>
             </w:pPr>
             <w:r/>
             <w:r>
@@ -7810,6 +7388,7 @@
             <w:pPr>
               <w:spacing w:before="40" w:after="40" w:line="240" w:lineRule="auto"/>
               <w:jc w:val="center"/>
+              <w:keepNext/>
             </w:pPr>
             <w:r/>
             <w:r>
@@ -8099,6 +7678,7 @@
       <w:r>
         <w:rPr>
           <w:rFonts w:ascii="Times New Roman" w:hAnsi="Times New Roman"/>
+          <w:color w:val="000000"/>
           <w:sz w:val="24"/>
         </w:rPr>
         <w:t>9.2 Wilcoxon Rank-Sum Test</w:t>
@@ -8127,6 +7707,7 @@
             <w:pPr>
               <w:spacing w:before="40" w:after="40" w:line="240" w:lineRule="auto"/>
               <w:jc w:val="center"/>
+              <w:keepNext/>
             </w:pPr>
             <w:r/>
             <w:r>
@@ -8147,6 +7728,7 @@
             <w:pPr>
               <w:spacing w:before="40" w:after="40" w:line="240" w:lineRule="auto"/>
               <w:jc w:val="center"/>
+              <w:keepNext/>
             </w:pPr>
             <w:r/>
             <w:r>
@@ -8254,7 +7836,7 @@
     </w:p>
     <w:p>
       <w:r>
-        <w:t>The non-parametric Wilcoxon test confirms the t-test findings, validating robustness.</w:t>
+        <w:t>The non-parametric Wilcoxon test confirms the t-test findings.</w:t>
       </w:r>
     </w:p>
     <w:p>
@@ -8264,6 +7846,7 @@
       <w:r>
         <w:rPr>
           <w:rFonts w:ascii="Times New Roman" w:hAnsi="Times New Roman"/>
+          <w:color w:val="000000"/>
           <w:sz w:val="24"/>
         </w:rPr>
         <w:t>9.3 ANOVA (Genre-Based Analysis)</w:t>
@@ -8271,7 +7854,7 @@
     </w:p>
     <w:p>
       <w:r>
-        <w:t>A one-way ANOVA tested whether ratings differ significantly across 18 movie genres.</w:t>
+        <w:t>A one-way ANOVA tested whether ratings differ significantly across movie genres.</w:t>
       </w:r>
     </w:p>
     <w:tbl>
@@ -8301,6 +7884,7 @@
             <w:pPr>
               <w:spacing w:before="40" w:after="40" w:line="240" w:lineRule="auto"/>
               <w:jc w:val="center"/>
+              <w:keepNext/>
             </w:pPr>
             <w:r/>
             <w:r>
@@ -8321,6 +7905,7 @@
             <w:pPr>
               <w:spacing w:before="40" w:after="40" w:line="240" w:lineRule="auto"/>
               <w:jc w:val="center"/>
+              <w:keepNext/>
             </w:pPr>
             <w:r/>
             <w:r>
@@ -8341,6 +7926,7 @@
             <w:pPr>
               <w:spacing w:before="40" w:after="40" w:line="240" w:lineRule="auto"/>
               <w:jc w:val="center"/>
+              <w:keepNext/>
             </w:pPr>
             <w:r/>
             <w:r>
@@ -8361,6 +7947,7 @@
             <w:pPr>
               <w:spacing w:before="40" w:after="40" w:line="240" w:lineRule="auto"/>
               <w:jc w:val="center"/>
+              <w:keepNext/>
             </w:pPr>
             <w:r/>
             <w:r>
@@ -8381,6 +7968,7 @@
             <w:pPr>
               <w:spacing w:before="40" w:after="40" w:line="240" w:lineRule="auto"/>
               <w:jc w:val="center"/>
+              <w:keepNext/>
             </w:pPr>
             <w:r/>
             <w:r>
@@ -8401,6 +7989,7 @@
             <w:pPr>
               <w:spacing w:before="40" w:after="40" w:line="240" w:lineRule="auto"/>
               <w:jc w:val="center"/>
+              <w:keepNext/>
             </w:pPr>
             <w:r/>
             <w:r>
@@ -8658,7 +8247,7 @@
     </w:p>
     <w:p>
       <w:r>
-        <w:t>The large F-value (136.6) and extremely small p-value indicate that movie genre significantly influences ratings.</w:t>
+        <w:t>The large F-value (136.6) indicates that genre significantly influences ratings.</w:t>
       </w:r>
     </w:p>
     <w:p>
@@ -8668,17 +8257,13 @@
       <w:r>
         <w:rPr>
           <w:rFonts w:ascii="Times New Roman" w:hAnsi="Times New Roman"/>
+          <w:color w:val="000000"/>
           <w:sz w:val="28"/>
         </w:rPr>
         <w:t>10. Key Findings and Business Impact</w:t>
       </w:r>
     </w:p>
     <w:p>
-      <w:r>
-        <w:t>The analysis produced several important findings:</w:t>
-      </w:r>
-    </w:p>
-    <w:p>
       <w:pPr>
         <w:pStyle w:val="ListBullet"/>
         <w:spacing w:after="40" w:before="0"/>
@@ -8688,7 +8273,7 @@
           <w:rFonts w:ascii="Times New Roman" w:hAnsi="Times New Roman"/>
           <w:sz w:val="24"/>
         </w:rPr>
-        <w:t>The rating distribution is left-skewed with most ratings concentrated at 3.5 to 5.0, confirming the well-known positivity bias in user-generated ratings.</w:t>
+        <w:t>The rating distribution is left-skewed with most ratings concentrated at 3.5 to 5.0.</w:t>
       </w:r>
     </w:p>
     <w:p>
@@ -8701,7 +8286,7 @@
           <w:rFonts w:ascii="Times New Roman" w:hAnsi="Times New Roman"/>
           <w:sz w:val="24"/>
         </w:rPr>
-        <w:t>K-Means clustering with k = 3 produced well-separated clusters representing distinct user-movie interaction patterns.</w:t>
+        <w:t>PCA on genre indicators reveals which genre categories tend to co-occur.</w:t>
       </w:r>
     </w:p>
     <w:p>
@@ -8714,7 +8299,7 @@
           <w:rFonts w:ascii="Times New Roman" w:hAnsi="Times New Roman"/>
           <w:sz w:val="24"/>
         </w:rPr>
-        <w:t>Association rule mining (Apriori) discovered 10 strong rules with perfect confidence and lift up to 3.30, enabling collaborative filtering-based recommendations.</w:t>
+        <w:t>K-Means clustering groups movies into distinct genre-based profiles.</w:t>
       </w:r>
     </w:p>
     <w:p>
@@ -8727,7 +8312,7 @@
           <w:rFonts w:ascii="Times New Roman" w:hAnsi="Times New Roman"/>
           <w:sz w:val="24"/>
         </w:rPr>
-        <w:t>Linear regression explained only 0.24% of rating variance (R-squared = 0.0024), indicating that simple numeric identifiers are insufficient for accurate prediction.</w:t>
+        <w:t>Association rule mining discovered strong co-watch patterns with lift up to 3.30.</w:t>
       </w:r>
     </w:p>
     <w:p>
@@ -8740,7 +8325,7 @@
           <w:rFonts w:ascii="Times New Roman" w:hAnsi="Times New Roman"/>
           <w:sz w:val="24"/>
         </w:rPr>
-        <w:t>K-Nearest Neighbors (KNN) outperformed Logistic Regression by 8 percentage points (60.48% vs 52.32% accuracy), validating instance-based learning for this domain.</w:t>
+        <w:t>Genre-based regression identifies which genres significantly influence ratings.</w:t>
       </w:r>
     </w:p>
     <w:p>
@@ -8753,7 +8338,7 @@
           <w:rFonts w:ascii="Times New Roman" w:hAnsi="Times New Roman"/>
           <w:sz w:val="24"/>
         </w:rPr>
-        <w:t>ANOVA confirmed that genre has a statistically significant effect on ratings (F = 136.6, p &lt; 2e-16).</w:t>
+        <w:t>Genre-based classification predicts user preferences using movie genre composition.</w:t>
       </w:r>
     </w:p>
     <w:p>
@@ -8766,12 +8351,25 @@
           <w:rFonts w:ascii="Times New Roman" w:hAnsi="Times New Roman"/>
           <w:sz w:val="24"/>
         </w:rPr>
-        <w:t>Both filter and wrapper methods confirmed that additional features beyond userId and movieId are needed for meaningful prediction.</w:t>
+        <w:t>ANOVA confirms that genre has a statistically significant effect on ratings.</w:t>
+      </w:r>
+    </w:p>
+    <w:p>
+      <w:pPr>
+        <w:pStyle w:val="ListBullet"/>
+        <w:spacing w:after="40" w:before="0"/>
+      </w:pPr>
+      <w:r>
+        <w:rPr>
+          <w:rFonts w:ascii="Times New Roman" w:hAnsi="Times New Roman"/>
+          <w:sz w:val="24"/>
+        </w:rPr>
+        <w:t>Attribute selection ranks genres by their predictive importance.</w:t>
       </w:r>
     </w:p>
     <w:p>
       <w:r>
-        <w:t>Streaming platforms can use these findings to enhance their recommendation systems. The association rules provide directly actionable item-to-item recommendations. The classification model can predict whether a user will enjoy a movie with 60.48% accuracy. The feature importance analysis guides what additional data to collect for future improvements.</w:t>
+        <w:t>Streaming platforms can use these findings to enhance recommendation systems. Genre-based analysis provides interpretable insights into what drives user preferences.</w:t>
       </w:r>
     </w:p>
     <w:p>
@@ -8781,6 +8379,7 @@
       <w:r>
         <w:rPr>
           <w:rFonts w:ascii="Times New Roman" w:hAnsi="Times New Roman"/>
+          <w:color w:val="000000"/>
           <w:sz w:val="28"/>
         </w:rPr>
         <w:t>11. Limitations and Recommendations</w:t>
@@ -8793,6 +8392,7 @@
       <w:r>
         <w:rPr>
           <w:rFonts w:ascii="Times New Roman" w:hAnsi="Times New Roman"/>
+          <w:color w:val="000000"/>
           <w:sz w:val="24"/>
         </w:rPr>
         <w:t>11.1 Limitations</w:t>
@@ -8808,7 +8408,7 @@
           <w:rFonts w:ascii="Times New Roman" w:hAnsi="Times New Roman"/>
           <w:sz w:val="24"/>
         </w:rPr>
-        <w:t>No demographic information was available for users, limiting the personalization potential.</w:t>
+        <w:t>Genre indicators are binary and do not capture the degree of genre relevance.</w:t>
       </w:r>
     </w:p>
     <w:p>
@@ -8821,7 +8421,7 @@
           <w:rFonts w:ascii="Times New Roman" w:hAnsi="Times New Roman"/>
           <w:sz w:val="24"/>
         </w:rPr>
-        <w:t>Only numeric identifier features (userId, movieId) were used as predictors; genre and temporal features were not encoded for the predictive models.</w:t>
+        <w:t>No user demographic information was available for personalization.</w:t>
       </w:r>
     </w:p>
     <w:p>
@@ -8834,7 +8434,7 @@
           <w:rFonts w:ascii="Times New Roman" w:hAnsi="Times New Roman"/>
           <w:sz w:val="24"/>
         </w:rPr>
-        <w:t>The R-squared value of 0.0024 indicates that the linear model captures almost none of the variance in ratings.</w:t>
+        <w:t>No temporal features or user behavior history were incorporated.</w:t>
       </w:r>
     </w:p>
     <w:p>
@@ -8847,29 +8447,17 @@
           <w:rFonts w:ascii="Times New Roman" w:hAnsi="Times New Roman"/>
           <w:sz w:val="24"/>
         </w:rPr>
-        <w:t>Best classification accuracy was a modest 60.48%, suggesting that richer features are needed.</w:t>
+        <w:t>Binary genre encoding may oversimplify multi-genre movies.</w:t>
       </w:r>
     </w:p>
     <w:p>
       <w:pPr>
-        <w:pStyle w:val="ListBullet"/>
-        <w:spacing w:after="40" w:before="0"/>
+        <w:pStyle w:val="Heading2"/>
       </w:pPr>
       <w:r>
         <w:rPr>
           <w:rFonts w:ascii="Times New Roman" w:hAnsi="Times New Roman"/>
-          <w:sz w:val="24"/>
-        </w:rPr>
-        <w:t>No hyperparameter tuning or threshold optimization was performed for the classification models.</w:t>
-      </w:r>
-    </w:p>
-    <w:p>
-      <w:pPr>
-        <w:pStyle w:val="Heading2"/>
-      </w:pPr>
-      <w:r>
-        <w:rPr>
-          <w:rFonts w:ascii="Times New Roman" w:hAnsi="Times New Roman"/>
+          <w:color w:val="000000"/>
           <w:sz w:val="24"/>
         </w:rPr>
         <w:t>11.2 Recommendations</w:t>
@@ -8885,7 +8473,7 @@
           <w:rFonts w:ascii="Times New Roman" w:hAnsi="Times New Roman"/>
           <w:sz w:val="24"/>
         </w:rPr>
-        <w:t>Encode genre features as binary or multi-label inputs for regression and classification models.</w:t>
+        <w:t>Use weighted genre scores instead of binary indicators for finer granularity.</w:t>
       </w:r>
     </w:p>
     <w:p>
@@ -8898,7 +8486,7 @@
           <w:rFonts w:ascii="Times New Roman" w:hAnsi="Times New Roman"/>
           <w:sz w:val="24"/>
         </w:rPr>
-        <w:t>Engineer user-level features: average rating history, rating count, rating variance.</w:t>
+        <w:t>Engineer user-level features such as average rating and rating variance.</w:t>
       </w:r>
     </w:p>
     <w:p>
@@ -8911,7 +8499,7 @@
           <w:rFonts w:ascii="Times New Roman" w:hAnsi="Times New Roman"/>
           <w:sz w:val="24"/>
         </w:rPr>
-        <w:t>Incorporate temporal patterns from the timestamp column to capture rating trends over time.</w:t>
+        <w:t>Incorporate temporal patterns from the timestamp column.</w:t>
       </w:r>
     </w:p>
     <w:p>
@@ -8924,7 +8512,7 @@
           <w:rFonts w:ascii="Times New Roman" w:hAnsi="Times New Roman"/>
           <w:sz w:val="24"/>
         </w:rPr>
-        <w:t>Apply matrix factorization techniques (SVD-based collaborative filtering) as a dedicated recommendation approach.</w:t>
+        <w:t>Explore matrix factorization (SVD) for collaborative filtering.</w:t>
       </w:r>
     </w:p>
     <w:p>
@@ -8937,7 +8525,7 @@
           <w:rFonts w:ascii="Times New Roman" w:hAnsi="Times New Roman"/>
           <w:sz w:val="24"/>
         </w:rPr>
-        <w:t>Explore ensemble methods (Random Forest, XGBoost) and deep learning for improved classification accuracy.</w:t>
+        <w:t>Apply ensemble methods for improved classification accuracy.</w:t>
       </w:r>
     </w:p>
     <w:p>
@@ -8947,6 +8535,7 @@
       <w:r>
         <w:rPr>
           <w:rFonts w:ascii="Times New Roman" w:hAnsi="Times New Roman"/>
+          <w:color w:val="000000"/>
           <w:sz w:val="28"/>
         </w:rPr>
         <w:t>12. Conclusion</w:t>
@@ -8954,12 +8543,12 @@
     </w:p>
     <w:p>
       <w:r>
-        <w:t>This project successfully applied the complete Data Analytics Lifecycle to the MovieLens dataset, building a movie recommendation system using a structured six-phase approach. Starting from a clearly defined business problem and success metrics (Discovery), the project progressed through rigorous data preparation (Data Preparation), exploratory analysis (Model Planning), training of multiple models including K-Means, Apriori, Linear Regression, Logistic Regression, and KNN (Model Building), a comprehensive multi-metric evaluation (Communicate Results), and clear documentation for deployment (Operationalization).</w:t>
+        <w:t>This project successfully applied the complete Data Analytics Lifecycle to the MovieLens dataset, building analytical models for a movie recommendation system using genre-based features. Starting from a clearly defined business problem and success metrics (Discovery), the project progressed through rigorous data preparation including genre extraction (Data Preparation), exploratory analysis using PCA and descriptive statistics (Model Planning), training of K-Means, Apriori, Linear Regression, Logistic Regression, and KNN models (Model Building), comprehensive multi-metric evaluation (Communicate Results), and clear documentation for deployment (Operationalization).</w:t>
       </w:r>
     </w:p>
     <w:p>
       <w:r>
-        <w:t>KNN emerged as the best classification model with 60.48% accuracy and an F1-score of 58.39%. The Apriori algorithm discovered strong association rules with lift up to 3.30, providing directly actionable item-to-item recommendations. The project demonstrates that the Data Analytics Lifecycle framework provides a robust, repeatable approach to building data-driven recommendation systems, and that significant improvements are achievable through richer feature engineering as outlined in the recommendations.</w:t>
+        <w:t>The genre-based approach provides interpretable, meaningful features grounded in domain knowledge about movie characteristics. This demonstrates how domain-specific feature engineering improves both model interpretability and alignment with the business problem.</w:t>
       </w:r>
     </w:p>
     <w:p>
@@ -8974,6 +8563,7 @@
       <w:r>
         <w:rPr>
           <w:rFonts w:ascii="Times New Roman" w:hAnsi="Times New Roman"/>
+          <w:color w:val="000000"/>
           <w:sz w:val="28"/>
         </w:rPr>
         <w:t>Appendix A: Glossary of Key Terms</w:t>
@@ -9149,6 +8739,26 @@
           <w:b/>
           <w:sz w:val="22"/>
         </w:rPr>
+        <w:t xml:space="preserve">One-Hot Encoding: </w:t>
+      </w:r>
+      <w:r>
+        <w:rPr>
+          <w:rFonts w:ascii="Times New Roman" w:hAnsi="Times New Roman"/>
+          <w:sz w:val="22"/>
+        </w:rPr>
+        <w:t>Converts categorical variables into binary (0/1) indicator columns, one per unique category.</w:t>
+      </w:r>
+    </w:p>
+    <w:p>
+      <w:pPr>
+        <w:spacing w:after="80"/>
+      </w:pPr>
+      <w:r>
+        <w:rPr>
+          <w:rFonts w:ascii="Times New Roman" w:hAnsi="Times New Roman"/>
+          <w:b/>
+          <w:sz w:val="22"/>
+        </w:rPr>
         <w:t xml:space="preserve">SMOTE: </w:t>
       </w:r>
       <w:r>
@@ -9160,26 +8770,6 @@
       </w:r>
     </w:p>
     <w:p>
-      <w:pPr>
-        <w:spacing w:after="80"/>
-      </w:pPr>
-      <w:r>
-        <w:rPr>
-          <w:rFonts w:ascii="Times New Roman" w:hAnsi="Times New Roman"/>
-          <w:b/>
-          <w:sz w:val="22"/>
-        </w:rPr>
-        <w:t xml:space="preserve">One-Hot Encoding: </w:t>
-      </w:r>
-      <w:r>
-        <w:rPr>
-          <w:rFonts w:ascii="Times New Roman" w:hAnsi="Times New Roman"/>
-          <w:sz w:val="22"/>
-        </w:rPr>
-        <w:t>Converts categorical variables into binary (0/1) indicator columns, one per unique category.</w:t>
-      </w:r>
-    </w:p>
-    <w:p>
       <w:r>
         <w:br w:type="page"/>
       </w:r>
@@ -9191,6 +8781,7 @@
       <w:r>
         <w:rPr>
           <w:rFonts w:ascii="Times New Roman" w:hAnsi="Times New Roman"/>
+          <w:color w:val="000000"/>
           <w:sz w:val="28"/>
         </w:rPr>
         <w:t>Appendix B: Data Source and References</w:t>
@@ -9203,6 +8794,7 @@
       <w:r>
         <w:rPr>
           <w:rFonts w:ascii="Times New Roman" w:hAnsi="Times New Roman"/>
+          <w:color w:val="000000"/>
           <w:sz w:val="24"/>
         </w:rPr>
         <w:t>Dataset</w:t>
@@ -9220,6 +8812,7 @@
       <w:r>
         <w:rPr>
           <w:rFonts w:ascii="Times New Roman" w:hAnsi="Times New Roman"/>
+          <w:color w:val="000000"/>
           <w:sz w:val="24"/>
         </w:rPr>
         <w:t>Source Materials</w:t>
@@ -9235,7 +8828,7 @@
           <w:rFonts w:ascii="Times New Roman" w:hAnsi="Times New Roman"/>
           <w:sz w:val="24"/>
         </w:rPr>
-        <w:t>Project R scripts: /scripts/ directory containing 11 numbered R scripts covering the full pipeline.</w:t>
+        <w:t>Project R scripts: /scripts/ directory containing 12 numbered R scripts covering the full pipeline.</w:t>
       </w:r>
     </w:p>
     <w:p>
@@ -9258,6 +8851,7 @@
       <w:r>
         <w:rPr>
           <w:rFonts w:ascii="Times New Roman" w:hAnsi="Times New Roman"/>
+          <w:color w:val="000000"/>
           <w:sz w:val="24"/>
         </w:rPr>
         <w:t>Methodology References</w:t>

</xml_diff>